<commit_message>
Se agrega ppt de metologia agil y arreglo de doc
</commit_message>
<xml_diff>
--- a/Documentacion Proyecto RedGasfi.docx
+++ b/Documentacion Proyecto RedGasfi.docx
@@ -3322,6 +3322,34 @@
     </w:p>
     <w:p>
       <w:pPr>
+        <w:numPr>
+          <w:ilvl w:val="0"/>
+          <w:numId w:val="12"/>
+        </w:numPr>
+        <w:spacing w:after="240" w:before="0" w:lineRule="auto"/>
+        <w:ind w:left="720" w:hanging="360"/>
+        <w:rPr>
+          <w:b w:val="1"/>
+          <w:bCs w:val="1"/>
+        </w:rPr>
+      </w:pPr>
+      <w:r>
+        <w:rPr>
+          <w:b w:val="1"/>
+          <w:bCs w:val="1"/>
+          <w:rtl w:val="0"/>
+        </w:rPr>
+        <w:t xml:space="preserve">Documentación : </w:t>
+      </w:r>
+      <w:r>
+        <w:rPr>
+          <w:rtl w:val="0"/>
+        </w:rPr>
+        <w:t xml:space="preserve">JavaSwing para documentar endpoints</w:t>
+      </w:r>
+    </w:p>
+    <w:p>
+      <w:pPr>
         <w:pStyle w:val="Heading3"/>
         <w:keepNext w:val="0"/>
         <w:keepLines w:val="0"/>
@@ -3809,6 +3837,32 @@
           <w:rtl w:val="0"/>
         </w:rPr>
         <w:t xml:space="preserve">Api sin clases, pero aca se añadirá lo que es jwt y redireccionamientos</w:t>
+      </w:r>
+    </w:p>
+    <w:p>
+      <w:pPr>
+        <w:rPr/>
+      </w:pPr>
+      <w:r>
+        <w:rPr>
+          <w:rtl w:val="0"/>
+        </w:rPr>
+      </w:r>
+    </w:p>
+    <w:p>
+      <w:pPr>
+        <w:rPr>
+          <w:b w:val="1"/>
+          <w:bCs w:val="1"/>
+        </w:rPr>
+      </w:pPr>
+      <w:r>
+        <w:rPr>
+          <w:b w:val="1"/>
+          <w:bCs w:val="1"/>
+          <w:rtl w:val="0"/>
+        </w:rPr>
+        <w:t xml:space="preserve">Todo esto es JavaSwing</w:t>
       </w:r>
     </w:p>
     <w:p>
@@ -5136,7 +5190,7 @@
     <w:sdt>
       <w:sdtPr>
         <w:lock w:val="contentLocked"/>
-        <w:id w:val="1088284377"/>
+        <w:id w:val="1265411145"/>
         <w:tag w:val="goog_rdk_229"/>
       </w:sdtPr>
       <w:sdtContent>
@@ -5183,7 +5237,7 @@
             <w:sdt>
               <w:sdtPr>
                 <w:lock w:val="contentLocked"/>
-                <w:id w:val="-75177937"/>
+                <w:id w:val="-1784301617"/>
                 <w:tag w:val="goog_rdk_0"/>
               </w:sdtPr>
               <w:sdtContent>
@@ -5244,7 +5298,7 @@
             <w:sdt>
               <w:sdtPr>
                 <w:lock w:val="contentLocked"/>
-                <w:id w:val="1014770684"/>
+                <w:id w:val="518575666"/>
                 <w:tag w:val="goog_rdk_6"/>
               </w:sdtPr>
               <w:sdtContent>
@@ -5297,7 +5351,7 @@
             <w:sdt>
               <w:sdtPr>
                 <w:lock w:val="contentLocked"/>
-                <w:id w:val="-960299882"/>
+                <w:id w:val="1997966528"/>
                 <w:tag w:val="goog_rdk_7"/>
               </w:sdtPr>
               <w:sdtContent>
@@ -5350,7 +5404,7 @@
             <w:sdt>
               <w:sdtPr>
                 <w:lock w:val="contentLocked"/>
-                <w:id w:val="-754655903"/>
+                <w:id w:val="2053795922"/>
                 <w:tag w:val="goog_rdk_8"/>
               </w:sdtPr>
               <w:sdtContent>
@@ -5403,7 +5457,7 @@
             <w:sdt>
               <w:sdtPr>
                 <w:lock w:val="contentLocked"/>
-                <w:id w:val="1886885637"/>
+                <w:id w:val="-520781093"/>
                 <w:tag w:val="goog_rdk_9"/>
               </w:sdtPr>
               <w:sdtContent>
@@ -5456,7 +5510,7 @@
             <w:sdt>
               <w:sdtPr>
                 <w:lock w:val="contentLocked"/>
-                <w:id w:val="-1558498625"/>
+                <w:id w:val="-558427739"/>
                 <w:tag w:val="goog_rdk_10"/>
               </w:sdtPr>
               <w:sdtContent>
@@ -5509,7 +5563,7 @@
             <w:sdt>
               <w:sdtPr>
                 <w:lock w:val="contentLocked"/>
-                <w:id w:val="-479113304"/>
+                <w:id w:val="1965714876"/>
                 <w:tag w:val="goog_rdk_11"/>
               </w:sdtPr>
               <w:sdtContent>
@@ -5569,7 +5623,7 @@
             <w:sdt>
               <w:sdtPr>
                 <w:lock w:val="contentLocked"/>
-                <w:id w:val="1642102499"/>
+                <w:id w:val="-1333180009"/>
                 <w:tag w:val="goog_rdk_12"/>
               </w:sdtPr>
               <w:sdtContent>
@@ -5629,7 +5683,7 @@
             <w:sdt>
               <w:sdtPr>
                 <w:lock w:val="contentLocked"/>
-                <w:id w:val="-79167039"/>
+                <w:id w:val="1041933369"/>
                 <w:tag w:val="goog_rdk_18"/>
               </w:sdtPr>
               <w:sdtContent>
@@ -5680,7 +5734,7 @@
             <w:sdt>
               <w:sdtPr>
                 <w:lock w:val="contentLocked"/>
-                <w:id w:val="1331252018"/>
+                <w:id w:val="1630305218"/>
                 <w:tag w:val="goog_rdk_19"/>
               </w:sdtPr>
               <w:sdtContent>
@@ -5732,7 +5786,7 @@
             <w:sdt>
               <w:sdtPr>
                 <w:lock w:val="contentLocked"/>
-                <w:id w:val="1861185085"/>
+                <w:id w:val="-1558324426"/>
                 <w:tag w:val="goog_rdk_20"/>
               </w:sdtPr>
               <w:sdtContent>
@@ -5781,7 +5835,7 @@
             <w:sdt>
               <w:sdtPr>
                 <w:lock w:val="contentLocked"/>
-                <w:id w:val="114612744"/>
+                <w:id w:val="-1520314747"/>
                 <w:tag w:val="goog_rdk_21"/>
               </w:sdtPr>
               <w:sdtContent>
@@ -5834,7 +5888,7 @@
             <w:sdt>
               <w:sdtPr>
                 <w:lock w:val="contentLocked"/>
-                <w:id w:val="712843282"/>
+                <w:id w:val="-30759986"/>
                 <w:tag w:val="goog_rdk_22"/>
               </w:sdtPr>
               <w:sdtContent>
@@ -5886,7 +5940,7 @@
             <w:sdt>
               <w:sdtPr>
                 <w:lock w:val="contentLocked"/>
-                <w:id w:val="615113392"/>
+                <w:id w:val="-1778698440"/>
                 <w:tag w:val="goog_rdk_23"/>
               </w:sdtPr>
               <w:sdtContent>
@@ -5944,7 +5998,7 @@
             <w:sdt>
               <w:sdtPr>
                 <w:lock w:val="contentLocked"/>
-                <w:id w:val="918190731"/>
+                <w:id w:val="502257142"/>
                 <w:tag w:val="goog_rdk_24"/>
               </w:sdtPr>
               <w:sdtContent>
@@ -5995,7 +6049,7 @@
             <w:sdt>
               <w:sdtPr>
                 <w:lock w:val="contentLocked"/>
-                <w:id w:val="-413928694"/>
+                <w:id w:val="983094812"/>
                 <w:tag w:val="goog_rdk_25"/>
               </w:sdtPr>
               <w:sdtContent>
@@ -6047,7 +6101,7 @@
             <w:sdt>
               <w:sdtPr>
                 <w:lock w:val="contentLocked"/>
-                <w:id w:val="-1236379412"/>
+                <w:id w:val="2122534930"/>
                 <w:tag w:val="goog_rdk_26"/>
               </w:sdtPr>
               <w:sdtContent>
@@ -6078,7 +6132,7 @@
                     </w:pPr>
                     <w:sdt>
                       <w:sdtPr>
-                        <w:id w:val="1998920155"/>
+                        <w:id w:val="1934134995"/>
                         <w:tag w:val="goog_rdk_27"/>
                       </w:sdtPr>
                       <w:sdtContent>
@@ -6107,7 +6161,7 @@
             <w:sdt>
               <w:sdtPr>
                 <w:lock w:val="contentLocked"/>
-                <w:id w:val="-533593018"/>
+                <w:id w:val="579092281"/>
                 <w:tag w:val="goog_rdk_28"/>
               </w:sdtPr>
               <w:sdtContent>
@@ -6160,7 +6214,7 @@
             <w:sdt>
               <w:sdtPr>
                 <w:lock w:val="contentLocked"/>
-                <w:id w:val="-653178104"/>
+                <w:id w:val="-1423764871"/>
                 <w:tag w:val="goog_rdk_29"/>
               </w:sdtPr>
               <w:sdtContent>
@@ -6212,7 +6266,7 @@
             <w:sdt>
               <w:sdtPr>
                 <w:lock w:val="contentLocked"/>
-                <w:id w:val="-95940847"/>
+                <w:id w:val="1746414175"/>
                 <w:tag w:val="goog_rdk_30"/>
               </w:sdtPr>
               <w:sdtContent>
@@ -6270,7 +6324,7 @@
             <w:sdt>
               <w:sdtPr>
                 <w:lock w:val="contentLocked"/>
-                <w:id w:val="-1524027139"/>
+                <w:id w:val="-278778165"/>
                 <w:tag w:val="goog_rdk_31"/>
               </w:sdtPr>
               <w:sdtContent>
@@ -6321,7 +6375,7 @@
             <w:sdt>
               <w:sdtPr>
                 <w:lock w:val="contentLocked"/>
-                <w:id w:val="-611690653"/>
+                <w:id w:val="-376269552"/>
                 <w:tag w:val="goog_rdk_32"/>
               </w:sdtPr>
               <w:sdtContent>
@@ -6373,7 +6427,7 @@
             <w:sdt>
               <w:sdtPr>
                 <w:lock w:val="contentLocked"/>
-                <w:id w:val="-528120189"/>
+                <w:id w:val="-1766985981"/>
                 <w:tag w:val="goog_rdk_33"/>
               </w:sdtPr>
               <w:sdtContent>
@@ -6422,7 +6476,7 @@
             <w:sdt>
               <w:sdtPr>
                 <w:lock w:val="contentLocked"/>
-                <w:id w:val="-793381291"/>
+                <w:id w:val="1148654036"/>
                 <w:tag w:val="goog_rdk_34"/>
               </w:sdtPr>
               <w:sdtContent>
@@ -6475,7 +6529,7 @@
             <w:sdt>
               <w:sdtPr>
                 <w:lock w:val="contentLocked"/>
-                <w:id w:val="-1963906398"/>
+                <w:id w:val="2010036269"/>
                 <w:tag w:val="goog_rdk_35"/>
               </w:sdtPr>
               <w:sdtContent>
@@ -6527,7 +6581,7 @@
             <w:sdt>
               <w:sdtPr>
                 <w:lock w:val="contentLocked"/>
-                <w:id w:val="-1947970498"/>
+                <w:id w:val="1529782260"/>
                 <w:tag w:val="goog_rdk_36"/>
               </w:sdtPr>
               <w:sdtContent>
@@ -6585,7 +6639,7 @@
             <w:sdt>
               <w:sdtPr>
                 <w:lock w:val="contentLocked"/>
-                <w:id w:val="-662827426"/>
+                <w:id w:val="1478627971"/>
                 <w:tag w:val="goog_rdk_37"/>
               </w:sdtPr>
               <w:sdtContent>
@@ -6636,7 +6690,7 @@
             <w:sdt>
               <w:sdtPr>
                 <w:lock w:val="contentLocked"/>
-                <w:id w:val="20298770"/>
+                <w:id w:val="-1414688115"/>
                 <w:tag w:val="goog_rdk_38"/>
               </w:sdtPr>
               <w:sdtContent>
@@ -6688,7 +6742,7 @@
             <w:sdt>
               <w:sdtPr>
                 <w:lock w:val="contentLocked"/>
-                <w:id w:val="1791661925"/>
+                <w:id w:val="472640895"/>
                 <w:tag w:val="goog_rdk_39"/>
               </w:sdtPr>
               <w:sdtContent>
@@ -6737,7 +6791,7 @@
             <w:sdt>
               <w:sdtPr>
                 <w:lock w:val="contentLocked"/>
-                <w:id w:val="595466244"/>
+                <w:id w:val="-1088654460"/>
                 <w:tag w:val="goog_rdk_40"/>
               </w:sdtPr>
               <w:sdtContent>
@@ -6790,7 +6844,7 @@
             <w:sdt>
               <w:sdtPr>
                 <w:lock w:val="contentLocked"/>
-                <w:id w:val="-660132515"/>
+                <w:id w:val="-1875809148"/>
                 <w:tag w:val="goog_rdk_41"/>
               </w:sdtPr>
               <w:sdtContent>
@@ -6842,7 +6896,7 @@
             <w:sdt>
               <w:sdtPr>
                 <w:lock w:val="contentLocked"/>
-                <w:id w:val="-1605896909"/>
+                <w:id w:val="1290818675"/>
                 <w:tag w:val="goog_rdk_42"/>
               </w:sdtPr>
               <w:sdtContent>
@@ -6900,7 +6954,7 @@
             <w:sdt>
               <w:sdtPr>
                 <w:lock w:val="contentLocked"/>
-                <w:id w:val="654753430"/>
+                <w:id w:val="-606021019"/>
                 <w:tag w:val="goog_rdk_43"/>
               </w:sdtPr>
               <w:sdtContent>
@@ -6941,7 +6995,7 @@
             <w:sdt>
               <w:sdtPr>
                 <w:lock w:val="contentLocked"/>
-                <w:id w:val="421541446"/>
+                <w:id w:val="-2119023899"/>
                 <w:tag w:val="goog_rdk_44"/>
               </w:sdtPr>
               <w:sdtContent>
@@ -6982,7 +7036,7 @@
             <w:sdt>
               <w:sdtPr>
                 <w:lock w:val="contentLocked"/>
-                <w:id w:val="-745718790"/>
+                <w:id w:val="-1473278786"/>
                 <w:tag w:val="goog_rdk_45"/>
               </w:sdtPr>
               <w:sdtContent>
@@ -7035,7 +7089,7 @@
             <w:sdt>
               <w:sdtPr>
                 <w:lock w:val="contentLocked"/>
-                <w:id w:val="1516182605"/>
+                <w:id w:val="1904006546"/>
                 <w:tag w:val="goog_rdk_46"/>
               </w:sdtPr>
               <w:sdtContent>
@@ -7088,7 +7142,7 @@
             <w:sdt>
               <w:sdtPr>
                 <w:lock w:val="contentLocked"/>
-                <w:id w:val="-1799663315"/>
+                <w:id w:val="131060752"/>
                 <w:tag w:val="goog_rdk_47"/>
               </w:sdtPr>
               <w:sdtContent>
@@ -7141,7 +7195,7 @@
             <w:sdt>
               <w:sdtPr>
                 <w:lock w:val="contentLocked"/>
-                <w:id w:val="-875987094"/>
+                <w:id w:val="-1020132823"/>
                 <w:tag w:val="goog_rdk_48"/>
               </w:sdtPr>
               <w:sdtContent>
@@ -7201,7 +7255,7 @@
             <w:sdt>
               <w:sdtPr>
                 <w:lock w:val="contentLocked"/>
-                <w:id w:val="-1645814513"/>
+                <w:id w:val="237914262"/>
                 <w:tag w:val="goog_rdk_49"/>
               </w:sdtPr>
               <w:sdtContent>
@@ -7242,7 +7296,7 @@
             <w:sdt>
               <w:sdtPr>
                 <w:lock w:val="contentLocked"/>
-                <w:id w:val="128935400"/>
+                <w:id w:val="853193952"/>
                 <w:tag w:val="goog_rdk_50"/>
               </w:sdtPr>
               <w:sdtContent>
@@ -7283,7 +7337,7 @@
             <w:sdt>
               <w:sdtPr>
                 <w:lock w:val="contentLocked"/>
-                <w:id w:val="1780739874"/>
+                <w:id w:val="460528"/>
                 <w:tag w:val="goog_rdk_51"/>
               </w:sdtPr>
               <w:sdtContent>
@@ -7324,7 +7378,7 @@
             <w:sdt>
               <w:sdtPr>
                 <w:lock w:val="contentLocked"/>
-                <w:id w:val="-941925850"/>
+                <w:id w:val="2059720991"/>
                 <w:tag w:val="goog_rdk_52"/>
               </w:sdtPr>
               <w:sdtContent>
@@ -7365,7 +7419,7 @@
             <w:sdt>
               <w:sdtPr>
                 <w:lock w:val="contentLocked"/>
-                <w:id w:val="960121670"/>
+                <w:id w:val="1352184686"/>
                 <w:tag w:val="goog_rdk_53"/>
               </w:sdtPr>
               <w:sdtContent>
@@ -7406,7 +7460,7 @@
             <w:sdt>
               <w:sdtPr>
                 <w:lock w:val="contentLocked"/>
-                <w:id w:val="1861754467"/>
+                <w:id w:val="1259064220"/>
                 <w:tag w:val="goog_rdk_54"/>
               </w:sdtPr>
               <w:sdtContent>
@@ -7454,7 +7508,7 @@
             <w:sdt>
               <w:sdtPr>
                 <w:lock w:val="contentLocked"/>
-                <w:id w:val="822066179"/>
+                <w:id w:val="1753503121"/>
                 <w:tag w:val="goog_rdk_55"/>
               </w:sdtPr>
               <w:sdtContent>
@@ -7514,7 +7568,7 @@
             <w:sdt>
               <w:sdtPr>
                 <w:lock w:val="contentLocked"/>
-                <w:id w:val="-350051065"/>
+                <w:id w:val="-650049858"/>
                 <w:tag w:val="goog_rdk_61"/>
               </w:sdtPr>
               <w:sdtContent>
@@ -7565,7 +7619,7 @@
             <w:sdt>
               <w:sdtPr>
                 <w:lock w:val="contentLocked"/>
-                <w:id w:val="402832416"/>
+                <w:id w:val="9075615"/>
                 <w:tag w:val="goog_rdk_62"/>
               </w:sdtPr>
               <w:sdtContent>
@@ -7617,7 +7671,7 @@
             <w:sdt>
               <w:sdtPr>
                 <w:lock w:val="contentLocked"/>
-                <w:id w:val="226814783"/>
+                <w:id w:val="-1104820837"/>
                 <w:tag w:val="goog_rdk_63"/>
               </w:sdtPr>
               <w:sdtContent>
@@ -7666,7 +7720,7 @@
             <w:sdt>
               <w:sdtPr>
                 <w:lock w:val="contentLocked"/>
-                <w:id w:val="1851010779"/>
+                <w:id w:val="-309156588"/>
                 <w:tag w:val="goog_rdk_64"/>
               </w:sdtPr>
               <w:sdtContent>
@@ -7719,7 +7773,7 @@
             <w:sdt>
               <w:sdtPr>
                 <w:lock w:val="contentLocked"/>
-                <w:id w:val="1405388882"/>
+                <w:id w:val="-239710362"/>
                 <w:tag w:val="goog_rdk_65"/>
               </w:sdtPr>
               <w:sdtContent>
@@ -7771,7 +7825,7 @@
             <w:sdt>
               <w:sdtPr>
                 <w:lock w:val="contentLocked"/>
-                <w:id w:val="-1155728945"/>
+                <w:id w:val="-1870185112"/>
                 <w:tag w:val="goog_rdk_66"/>
               </w:sdtPr>
               <w:sdtContent>
@@ -7829,7 +7883,7 @@
             <w:sdt>
               <w:sdtPr>
                 <w:lock w:val="contentLocked"/>
-                <w:id w:val="267992420"/>
+                <w:id w:val="1672310017"/>
                 <w:tag w:val="goog_rdk_67"/>
               </w:sdtPr>
               <w:sdtContent>
@@ -7880,7 +7934,7 @@
             <w:sdt>
               <w:sdtPr>
                 <w:lock w:val="contentLocked"/>
-                <w:id w:val="140620034"/>
+                <w:id w:val="-760505885"/>
                 <w:tag w:val="goog_rdk_68"/>
               </w:sdtPr>
               <w:sdtContent>
@@ -7932,7 +7986,7 @@
             <w:sdt>
               <w:sdtPr>
                 <w:lock w:val="contentLocked"/>
-                <w:id w:val="115487091"/>
+                <w:id w:val="1875911644"/>
                 <w:tag w:val="goog_rdk_69"/>
               </w:sdtPr>
               <w:sdtContent>
@@ -7981,7 +8035,7 @@
             <w:sdt>
               <w:sdtPr>
                 <w:lock w:val="contentLocked"/>
-                <w:id w:val="-756676431"/>
+                <w:id w:val="-121803644"/>
                 <w:tag w:val="goog_rdk_70"/>
               </w:sdtPr>
               <w:sdtContent>
@@ -8034,7 +8088,7 @@
             <w:sdt>
               <w:sdtPr>
                 <w:lock w:val="contentLocked"/>
-                <w:id w:val="817247789"/>
+                <w:id w:val="410069376"/>
                 <w:tag w:val="goog_rdk_71"/>
               </w:sdtPr>
               <w:sdtContent>
@@ -8086,7 +8140,7 @@
             <w:sdt>
               <w:sdtPr>
                 <w:lock w:val="contentLocked"/>
-                <w:id w:val="1270420072"/>
+                <w:id w:val="486341593"/>
                 <w:tag w:val="goog_rdk_72"/>
               </w:sdtPr>
               <w:sdtContent>
@@ -8144,7 +8198,7 @@
             <w:sdt>
               <w:sdtPr>
                 <w:lock w:val="contentLocked"/>
-                <w:id w:val="-73500471"/>
+                <w:id w:val="1231890582"/>
                 <w:tag w:val="goog_rdk_73"/>
               </w:sdtPr>
               <w:sdtContent>
@@ -8195,7 +8249,7 @@
             <w:sdt>
               <w:sdtPr>
                 <w:lock w:val="contentLocked"/>
-                <w:id w:val="-1995700245"/>
+                <w:id w:val="-758774067"/>
                 <w:tag w:val="goog_rdk_74"/>
               </w:sdtPr>
               <w:sdtContent>
@@ -8247,7 +8301,7 @@
             <w:sdt>
               <w:sdtPr>
                 <w:lock w:val="contentLocked"/>
-                <w:id w:val="1965714655"/>
+                <w:id w:val="-2041092800"/>
                 <w:tag w:val="goog_rdk_75"/>
               </w:sdtPr>
               <w:sdtContent>
@@ -8296,7 +8350,7 @@
             <w:sdt>
               <w:sdtPr>
                 <w:lock w:val="contentLocked"/>
-                <w:id w:val="-951451107"/>
+                <w:id w:val="483200540"/>
                 <w:tag w:val="goog_rdk_76"/>
               </w:sdtPr>
               <w:sdtContent>
@@ -8349,7 +8403,7 @@
             <w:sdt>
               <w:sdtPr>
                 <w:lock w:val="contentLocked"/>
-                <w:id w:val="-4986496"/>
+                <w:id w:val="569611773"/>
                 <w:tag w:val="goog_rdk_77"/>
               </w:sdtPr>
               <w:sdtContent>
@@ -8401,7 +8455,7 @@
             <w:sdt>
               <w:sdtPr>
                 <w:lock w:val="contentLocked"/>
-                <w:id w:val="-1981201839"/>
+                <w:id w:val="-1340345333"/>
                 <w:tag w:val="goog_rdk_78"/>
               </w:sdtPr>
               <w:sdtContent>
@@ -8459,7 +8513,7 @@
             <w:sdt>
               <w:sdtPr>
                 <w:lock w:val="contentLocked"/>
-                <w:id w:val="-493435075"/>
+                <w:id w:val="563283845"/>
                 <w:tag w:val="goog_rdk_79"/>
               </w:sdtPr>
               <w:sdtContent>
@@ -8500,7 +8554,7 @@
             <w:sdt>
               <w:sdtPr>
                 <w:lock w:val="contentLocked"/>
-                <w:id w:val="1473573496"/>
+                <w:id w:val="270805021"/>
                 <w:tag w:val="goog_rdk_80"/>
               </w:sdtPr>
               <w:sdtContent>
@@ -8541,7 +8595,7 @@
             <w:sdt>
               <w:sdtPr>
                 <w:lock w:val="contentLocked"/>
-                <w:id w:val="-124814282"/>
+                <w:id w:val="968383985"/>
                 <w:tag w:val="goog_rdk_81"/>
               </w:sdtPr>
               <w:sdtContent>
@@ -8594,7 +8648,7 @@
             <w:sdt>
               <w:sdtPr>
                 <w:lock w:val="contentLocked"/>
-                <w:id w:val="1943568126"/>
+                <w:id w:val="-1024733046"/>
                 <w:tag w:val="goog_rdk_82"/>
               </w:sdtPr>
               <w:sdtContent>
@@ -8647,7 +8701,7 @@
             <w:sdt>
               <w:sdtPr>
                 <w:lock w:val="contentLocked"/>
-                <w:id w:val="-1563919103"/>
+                <w:id w:val="1942389746"/>
                 <w:tag w:val="goog_rdk_83"/>
               </w:sdtPr>
               <w:sdtContent>
@@ -8700,7 +8754,7 @@
             <w:sdt>
               <w:sdtPr>
                 <w:lock w:val="contentLocked"/>
-                <w:id w:val="744746853"/>
+                <w:id w:val="-1027692256"/>
                 <w:tag w:val="goog_rdk_84"/>
               </w:sdtPr>
               <w:sdtContent>
@@ -8760,7 +8814,7 @@
             <w:sdt>
               <w:sdtPr>
                 <w:lock w:val="contentLocked"/>
-                <w:id w:val="-1588173403"/>
+                <w:id w:val="1807000549"/>
                 <w:tag w:val="goog_rdk_85"/>
               </w:sdtPr>
               <w:sdtContent>
@@ -8801,7 +8855,7 @@
             <w:sdt>
               <w:sdtPr>
                 <w:lock w:val="contentLocked"/>
-                <w:id w:val="-1315774159"/>
+                <w:id w:val="1948419953"/>
                 <w:tag w:val="goog_rdk_86"/>
               </w:sdtPr>
               <w:sdtContent>
@@ -8842,7 +8896,7 @@
             <w:sdt>
               <w:sdtPr>
                 <w:lock w:val="contentLocked"/>
-                <w:id w:val="1868508739"/>
+                <w:id w:val="705312625"/>
                 <w:tag w:val="goog_rdk_87"/>
               </w:sdtPr>
               <w:sdtContent>
@@ -8883,7 +8937,7 @@
             <w:sdt>
               <w:sdtPr>
                 <w:lock w:val="contentLocked"/>
-                <w:id w:val="852887497"/>
+                <w:id w:val="-27608329"/>
                 <w:tag w:val="goog_rdk_88"/>
               </w:sdtPr>
               <w:sdtContent>
@@ -8924,7 +8978,7 @@
             <w:sdt>
               <w:sdtPr>
                 <w:lock w:val="contentLocked"/>
-                <w:id w:val="-1305939552"/>
+                <w:id w:val="922977049"/>
                 <w:tag w:val="goog_rdk_89"/>
               </w:sdtPr>
               <w:sdtContent>
@@ -8965,7 +9019,7 @@
             <w:sdt>
               <w:sdtPr>
                 <w:lock w:val="contentLocked"/>
-                <w:id w:val="-516335173"/>
+                <w:id w:val="-1580942051"/>
                 <w:tag w:val="goog_rdk_90"/>
               </w:sdtPr>
               <w:sdtContent>
@@ -9013,7 +9067,7 @@
             <w:sdt>
               <w:sdtPr>
                 <w:lock w:val="contentLocked"/>
-                <w:id w:val="1662060025"/>
+                <w:id w:val="15734689"/>
                 <w:tag w:val="goog_rdk_91"/>
               </w:sdtPr>
               <w:sdtContent>
@@ -9073,7 +9127,7 @@
             <w:sdt>
               <w:sdtPr>
                 <w:lock w:val="contentLocked"/>
-                <w:id w:val="241578079"/>
+                <w:id w:val="-919854523"/>
                 <w:tag w:val="goog_rdk_97"/>
               </w:sdtPr>
               <w:sdtContent>
@@ -9124,7 +9178,7 @@
             <w:sdt>
               <w:sdtPr>
                 <w:lock w:val="contentLocked"/>
-                <w:id w:val="1276044837"/>
+                <w:id w:val="359597812"/>
                 <w:tag w:val="goog_rdk_98"/>
               </w:sdtPr>
               <w:sdtContent>
@@ -9176,7 +9230,7 @@
             <w:sdt>
               <w:sdtPr>
                 <w:lock w:val="contentLocked"/>
-                <w:id w:val="-1553278201"/>
+                <w:id w:val="2120054777"/>
                 <w:tag w:val="goog_rdk_99"/>
               </w:sdtPr>
               <w:sdtContent>
@@ -9225,7 +9279,7 @@
             <w:sdt>
               <w:sdtPr>
                 <w:lock w:val="contentLocked"/>
-                <w:id w:val="-1011872290"/>
+                <w:id w:val="-1269530038"/>
                 <w:tag w:val="goog_rdk_100"/>
               </w:sdtPr>
               <w:sdtContent>
@@ -9278,7 +9332,7 @@
             <w:sdt>
               <w:sdtPr>
                 <w:lock w:val="contentLocked"/>
-                <w:id w:val="1121030394"/>
+                <w:id w:val="680412874"/>
                 <w:tag w:val="goog_rdk_101"/>
               </w:sdtPr>
               <w:sdtContent>
@@ -9330,7 +9384,7 @@
             <w:sdt>
               <w:sdtPr>
                 <w:lock w:val="contentLocked"/>
-                <w:id w:val="581284280"/>
+                <w:id w:val="-1769135695"/>
                 <w:tag w:val="goog_rdk_102"/>
               </w:sdtPr>
               <w:sdtContent>
@@ -9388,7 +9442,7 @@
             <w:sdt>
               <w:sdtPr>
                 <w:lock w:val="contentLocked"/>
-                <w:id w:val="-1981672895"/>
+                <w:id w:val="858546319"/>
                 <w:tag w:val="goog_rdk_103"/>
               </w:sdtPr>
               <w:sdtContent>
@@ -9439,7 +9493,7 @@
             <w:sdt>
               <w:sdtPr>
                 <w:lock w:val="contentLocked"/>
-                <w:id w:val="1020276765"/>
+                <w:id w:val="-989373798"/>
                 <w:tag w:val="goog_rdk_104"/>
               </w:sdtPr>
               <w:sdtContent>
@@ -9491,7 +9545,7 @@
             <w:sdt>
               <w:sdtPr>
                 <w:lock w:val="contentLocked"/>
-                <w:id w:val="1562056705"/>
+                <w:id w:val="1827244661"/>
                 <w:tag w:val="goog_rdk_105"/>
               </w:sdtPr>
               <w:sdtContent>
@@ -9540,7 +9594,7 @@
             <w:sdt>
               <w:sdtPr>
                 <w:lock w:val="contentLocked"/>
-                <w:id w:val="643552150"/>
+                <w:id w:val="-1425060230"/>
                 <w:tag w:val="goog_rdk_106"/>
               </w:sdtPr>
               <w:sdtContent>
@@ -9593,7 +9647,7 @@
             <w:sdt>
               <w:sdtPr>
                 <w:lock w:val="contentLocked"/>
-                <w:id w:val="-567436059"/>
+                <w:id w:val="-163523249"/>
                 <w:tag w:val="goog_rdk_107"/>
               </w:sdtPr>
               <w:sdtContent>
@@ -9645,7 +9699,7 @@
             <w:sdt>
               <w:sdtPr>
                 <w:lock w:val="contentLocked"/>
-                <w:id w:val="575180364"/>
+                <w:id w:val="1744168039"/>
                 <w:tag w:val="goog_rdk_108"/>
               </w:sdtPr>
               <w:sdtContent>
@@ -9703,7 +9757,7 @@
             <w:sdt>
               <w:sdtPr>
                 <w:lock w:val="contentLocked"/>
-                <w:id w:val="612016885"/>
+                <w:id w:val="-1717539457"/>
                 <w:tag w:val="goog_rdk_109"/>
               </w:sdtPr>
               <w:sdtContent>
@@ -9744,7 +9798,7 @@
             <w:sdt>
               <w:sdtPr>
                 <w:lock w:val="contentLocked"/>
-                <w:id w:val="-1993898272"/>
+                <w:id w:val="-641696039"/>
                 <w:tag w:val="goog_rdk_110"/>
               </w:sdtPr>
               <w:sdtContent>
@@ -9785,7 +9839,7 @@
             <w:sdt>
               <w:sdtPr>
                 <w:lock w:val="contentLocked"/>
-                <w:id w:val="-1243958359"/>
+                <w:id w:val="369225676"/>
                 <w:tag w:val="goog_rdk_111"/>
               </w:sdtPr>
               <w:sdtContent>
@@ -9838,7 +9892,7 @@
             <w:sdt>
               <w:sdtPr>
                 <w:lock w:val="contentLocked"/>
-                <w:id w:val="124869691"/>
+                <w:id w:val="-527729986"/>
                 <w:tag w:val="goog_rdk_112"/>
               </w:sdtPr>
               <w:sdtContent>
@@ -9891,7 +9945,7 @@
             <w:sdt>
               <w:sdtPr>
                 <w:lock w:val="contentLocked"/>
-                <w:id w:val="1009164434"/>
+                <w:id w:val="-557277313"/>
                 <w:tag w:val="goog_rdk_113"/>
               </w:sdtPr>
               <w:sdtContent>
@@ -9944,7 +9998,7 @@
             <w:sdt>
               <w:sdtPr>
                 <w:lock w:val="contentLocked"/>
-                <w:id w:val="1805796507"/>
+                <w:id w:val="1849224381"/>
                 <w:tag w:val="goog_rdk_114"/>
               </w:sdtPr>
               <w:sdtContent>
@@ -10004,7 +10058,7 @@
             <w:sdt>
               <w:sdtPr>
                 <w:lock w:val="contentLocked"/>
-                <w:id w:val="-982694025"/>
+                <w:id w:val="1499335123"/>
                 <w:tag w:val="goog_rdk_115"/>
               </w:sdtPr>
               <w:sdtContent>
@@ -10045,7 +10099,7 @@
             <w:sdt>
               <w:sdtPr>
                 <w:lock w:val="contentLocked"/>
-                <w:id w:val="-1351128570"/>
+                <w:id w:val="296244355"/>
                 <w:tag w:val="goog_rdk_116"/>
               </w:sdtPr>
               <w:sdtContent>
@@ -10086,7 +10140,7 @@
             <w:sdt>
               <w:sdtPr>
                 <w:lock w:val="contentLocked"/>
-                <w:id w:val="-382050373"/>
+                <w:id w:val="1467675646"/>
                 <w:tag w:val="goog_rdk_117"/>
               </w:sdtPr>
               <w:sdtContent>
@@ -10127,7 +10181,7 @@
             <w:sdt>
               <w:sdtPr>
                 <w:lock w:val="contentLocked"/>
-                <w:id w:val="-1216665557"/>
+                <w:id w:val="390804729"/>
                 <w:tag w:val="goog_rdk_118"/>
               </w:sdtPr>
               <w:sdtContent>
@@ -10168,7 +10222,7 @@
             <w:sdt>
               <w:sdtPr>
                 <w:lock w:val="contentLocked"/>
-                <w:id w:val="-1592880192"/>
+                <w:id w:val="764648354"/>
                 <w:tag w:val="goog_rdk_119"/>
               </w:sdtPr>
               <w:sdtContent>
@@ -10209,7 +10263,7 @@
             <w:sdt>
               <w:sdtPr>
                 <w:lock w:val="contentLocked"/>
-                <w:id w:val="381948151"/>
+                <w:id w:val="-1917466790"/>
                 <w:tag w:val="goog_rdk_120"/>
               </w:sdtPr>
               <w:sdtContent>
@@ -10257,7 +10311,7 @@
             <w:sdt>
               <w:sdtPr>
                 <w:lock w:val="contentLocked"/>
-                <w:id w:val="761883114"/>
+                <w:id w:val="1555802798"/>
                 <w:tag w:val="goog_rdk_121"/>
               </w:sdtPr>
               <w:sdtContent>
@@ -10317,7 +10371,7 @@
             <w:sdt>
               <w:sdtPr>
                 <w:lock w:val="contentLocked"/>
-                <w:id w:val="654878486"/>
+                <w:id w:val="415367738"/>
                 <w:tag w:val="goog_rdk_127"/>
               </w:sdtPr>
               <w:sdtContent>
@@ -10368,7 +10422,7 @@
             <w:sdt>
               <w:sdtPr>
                 <w:lock w:val="contentLocked"/>
-                <w:id w:val="62295860"/>
+                <w:id w:val="1404150418"/>
                 <w:tag w:val="goog_rdk_128"/>
               </w:sdtPr>
               <w:sdtContent>
@@ -10420,7 +10474,7 @@
             <w:sdt>
               <w:sdtPr>
                 <w:lock w:val="contentLocked"/>
-                <w:id w:val="-679457624"/>
+                <w:id w:val="-1421989085"/>
                 <w:tag w:val="goog_rdk_129"/>
               </w:sdtPr>
               <w:sdtContent>
@@ -10469,7 +10523,7 @@
             <w:sdt>
               <w:sdtPr>
                 <w:lock w:val="contentLocked"/>
-                <w:id w:val="1569444680"/>
+                <w:id w:val="805110538"/>
                 <w:tag w:val="goog_rdk_130"/>
               </w:sdtPr>
               <w:sdtContent>
@@ -10522,7 +10576,7 @@
             <w:sdt>
               <w:sdtPr>
                 <w:lock w:val="contentLocked"/>
-                <w:id w:val="-935168416"/>
+                <w:id w:val="-496070832"/>
                 <w:tag w:val="goog_rdk_131"/>
               </w:sdtPr>
               <w:sdtContent>
@@ -10574,7 +10628,7 @@
             <w:sdt>
               <w:sdtPr>
                 <w:lock w:val="contentLocked"/>
-                <w:id w:val="735102452"/>
+                <w:id w:val="977535735"/>
                 <w:tag w:val="goog_rdk_132"/>
               </w:sdtPr>
               <w:sdtContent>
@@ -10632,7 +10686,7 @@
             <w:sdt>
               <w:sdtPr>
                 <w:lock w:val="contentLocked"/>
-                <w:id w:val="1349878491"/>
+                <w:id w:val="-639080796"/>
                 <w:tag w:val="goog_rdk_133"/>
               </w:sdtPr>
               <w:sdtContent>
@@ -10683,7 +10737,7 @@
             <w:sdt>
               <w:sdtPr>
                 <w:lock w:val="contentLocked"/>
-                <w:id w:val="1523029734"/>
+                <w:id w:val="481341102"/>
                 <w:tag w:val="goog_rdk_134"/>
               </w:sdtPr>
               <w:sdtContent>
@@ -10735,7 +10789,7 @@
             <w:sdt>
               <w:sdtPr>
                 <w:lock w:val="contentLocked"/>
-                <w:id w:val="1729013510"/>
+                <w:id w:val="1475670548"/>
                 <w:tag w:val="goog_rdk_135"/>
               </w:sdtPr>
               <w:sdtContent>
@@ -10784,7 +10838,7 @@
             <w:sdt>
               <w:sdtPr>
                 <w:lock w:val="contentLocked"/>
-                <w:id w:val="310121803"/>
+                <w:id w:val="-99999458"/>
                 <w:tag w:val="goog_rdk_136"/>
               </w:sdtPr>
               <w:sdtContent>
@@ -10837,7 +10891,7 @@
             <w:sdt>
               <w:sdtPr>
                 <w:lock w:val="contentLocked"/>
-                <w:id w:val="709028144"/>
+                <w:id w:val="-351492876"/>
                 <w:tag w:val="goog_rdk_137"/>
               </w:sdtPr>
               <w:sdtContent>
@@ -10889,7 +10943,7 @@
             <w:sdt>
               <w:sdtPr>
                 <w:lock w:val="contentLocked"/>
-                <w:id w:val="-814874451"/>
+                <w:id w:val="-1536520125"/>
                 <w:tag w:val="goog_rdk_138"/>
               </w:sdtPr>
               <w:sdtContent>
@@ -10947,7 +11001,7 @@
             <w:sdt>
               <w:sdtPr>
                 <w:lock w:val="contentLocked"/>
-                <w:id w:val="1645072568"/>
+                <w:id w:val="310981174"/>
                 <w:tag w:val="goog_rdk_139"/>
               </w:sdtPr>
               <w:sdtContent>
@@ -10998,7 +11052,7 @@
             <w:sdt>
               <w:sdtPr>
                 <w:lock w:val="contentLocked"/>
-                <w:id w:val="-399718478"/>
+                <w:id w:val="172244709"/>
                 <w:tag w:val="goog_rdk_140"/>
               </w:sdtPr>
               <w:sdtContent>
@@ -11050,7 +11104,7 @@
             <w:sdt>
               <w:sdtPr>
                 <w:lock w:val="contentLocked"/>
-                <w:id w:val="2014105169"/>
+                <w:id w:val="-91009337"/>
                 <w:tag w:val="goog_rdk_141"/>
               </w:sdtPr>
               <w:sdtContent>
@@ -11099,7 +11153,7 @@
             <w:sdt>
               <w:sdtPr>
                 <w:lock w:val="contentLocked"/>
-                <w:id w:val="-1713022482"/>
+                <w:id w:val="1408779027"/>
                 <w:tag w:val="goog_rdk_142"/>
               </w:sdtPr>
               <w:sdtContent>
@@ -11152,7 +11206,7 @@
             <w:sdt>
               <w:sdtPr>
                 <w:lock w:val="contentLocked"/>
-                <w:id w:val="358260969"/>
+                <w:id w:val="239746063"/>
                 <w:tag w:val="goog_rdk_143"/>
               </w:sdtPr>
               <w:sdtContent>
@@ -11204,7 +11258,7 @@
             <w:sdt>
               <w:sdtPr>
                 <w:lock w:val="contentLocked"/>
-                <w:id w:val="-1027018610"/>
+                <w:id w:val="-1728226539"/>
                 <w:tag w:val="goog_rdk_144"/>
               </w:sdtPr>
               <w:sdtContent>
@@ -11262,7 +11316,7 @@
             <w:sdt>
               <w:sdtPr>
                 <w:lock w:val="contentLocked"/>
-                <w:id w:val="-536463275"/>
+                <w:id w:val="-1938788255"/>
                 <w:tag w:val="goog_rdk_145"/>
               </w:sdtPr>
               <w:sdtContent>
@@ -11313,7 +11367,7 @@
             <w:sdt>
               <w:sdtPr>
                 <w:lock w:val="contentLocked"/>
-                <w:id w:val="-1103237199"/>
+                <w:id w:val="-926663004"/>
                 <w:tag w:val="goog_rdk_146"/>
               </w:sdtPr>
               <w:sdtContent>
@@ -11365,7 +11419,7 @@
             <w:sdt>
               <w:sdtPr>
                 <w:lock w:val="contentLocked"/>
-                <w:id w:val="-780869586"/>
+                <w:id w:val="1942614205"/>
                 <w:tag w:val="goog_rdk_147"/>
               </w:sdtPr>
               <w:sdtContent>
@@ -11414,7 +11468,7 @@
             <w:sdt>
               <w:sdtPr>
                 <w:lock w:val="contentLocked"/>
-                <w:id w:val="-1036368186"/>
+                <w:id w:val="-194370374"/>
                 <w:tag w:val="goog_rdk_148"/>
               </w:sdtPr>
               <w:sdtContent>
@@ -11467,7 +11521,7 @@
             <w:sdt>
               <w:sdtPr>
                 <w:lock w:val="contentLocked"/>
-                <w:id w:val="2109189961"/>
+                <w:id w:val="1779314334"/>
                 <w:tag w:val="goog_rdk_149"/>
               </w:sdtPr>
               <w:sdtContent>
@@ -11519,7 +11573,7 @@
             <w:sdt>
               <w:sdtPr>
                 <w:lock w:val="contentLocked"/>
-                <w:id w:val="-1455885346"/>
+                <w:id w:val="438399220"/>
                 <w:tag w:val="goog_rdk_150"/>
               </w:sdtPr>
               <w:sdtContent>
@@ -11577,7 +11631,7 @@
             <w:sdt>
               <w:sdtPr>
                 <w:lock w:val="contentLocked"/>
-                <w:id w:val="-841447881"/>
+                <w:id w:val="-1407680032"/>
                 <w:tag w:val="goog_rdk_151"/>
               </w:sdtPr>
               <w:sdtContent>
@@ -11618,7 +11672,7 @@
             <w:sdt>
               <w:sdtPr>
                 <w:lock w:val="contentLocked"/>
-                <w:id w:val="657624025"/>
+                <w:id w:val="-1522287560"/>
                 <w:tag w:val="goog_rdk_152"/>
               </w:sdtPr>
               <w:sdtContent>
@@ -11659,7 +11713,7 @@
             <w:sdt>
               <w:sdtPr>
                 <w:lock w:val="contentLocked"/>
-                <w:id w:val="346233677"/>
+                <w:id w:val="-316699448"/>
                 <w:tag w:val="goog_rdk_153"/>
               </w:sdtPr>
               <w:sdtContent>
@@ -11712,7 +11766,7 @@
             <w:sdt>
               <w:sdtPr>
                 <w:lock w:val="contentLocked"/>
-                <w:id w:val="203091346"/>
+                <w:id w:val="897559149"/>
                 <w:tag w:val="goog_rdk_154"/>
               </w:sdtPr>
               <w:sdtContent>
@@ -11765,7 +11819,7 @@
             <w:sdt>
               <w:sdtPr>
                 <w:lock w:val="contentLocked"/>
-                <w:id w:val="-1162682830"/>
+                <w:id w:val="778904330"/>
                 <w:tag w:val="goog_rdk_155"/>
               </w:sdtPr>
               <w:sdtContent>
@@ -11818,7 +11872,7 @@
             <w:sdt>
               <w:sdtPr>
                 <w:lock w:val="contentLocked"/>
-                <w:id w:val="-639335408"/>
+                <w:id w:val="-808958149"/>
                 <w:tag w:val="goog_rdk_156"/>
               </w:sdtPr>
               <w:sdtContent>
@@ -11878,7 +11932,7 @@
             <w:sdt>
               <w:sdtPr>
                 <w:lock w:val="contentLocked"/>
-                <w:id w:val="-1143558011"/>
+                <w:id w:val="-1097497318"/>
                 <w:tag w:val="goog_rdk_157"/>
               </w:sdtPr>
               <w:sdtContent>
@@ -11919,7 +11973,7 @@
             <w:sdt>
               <w:sdtPr>
                 <w:lock w:val="contentLocked"/>
-                <w:id w:val="-1456752308"/>
+                <w:id w:val="869455448"/>
                 <w:tag w:val="goog_rdk_158"/>
               </w:sdtPr>
               <w:sdtContent>
@@ -11960,7 +12014,7 @@
             <w:sdt>
               <w:sdtPr>
                 <w:lock w:val="contentLocked"/>
-                <w:id w:val="-781730741"/>
+                <w:id w:val="2143684132"/>
                 <w:tag w:val="goog_rdk_159"/>
               </w:sdtPr>
               <w:sdtContent>
@@ -12001,7 +12055,7 @@
             <w:sdt>
               <w:sdtPr>
                 <w:lock w:val="contentLocked"/>
-                <w:id w:val="347308159"/>
+                <w:id w:val="-1135914394"/>
                 <w:tag w:val="goog_rdk_160"/>
               </w:sdtPr>
               <w:sdtContent>
@@ -12042,7 +12096,7 @@
             <w:sdt>
               <w:sdtPr>
                 <w:lock w:val="contentLocked"/>
-                <w:id w:val="-348066987"/>
+                <w:id w:val="1840278885"/>
                 <w:tag w:val="goog_rdk_161"/>
               </w:sdtPr>
               <w:sdtContent>
@@ -12083,7 +12137,7 @@
             <w:sdt>
               <w:sdtPr>
                 <w:lock w:val="contentLocked"/>
-                <w:id w:val="-1023010271"/>
+                <w:id w:val="1840711566"/>
                 <w:tag w:val="goog_rdk_162"/>
               </w:sdtPr>
               <w:sdtContent>
@@ -12131,7 +12185,7 @@
             <w:sdt>
               <w:sdtPr>
                 <w:lock w:val="contentLocked"/>
-                <w:id w:val="-942096096"/>
+                <w:id w:val="-837178679"/>
                 <w:tag w:val="goog_rdk_163"/>
               </w:sdtPr>
               <w:sdtContent>
@@ -12191,7 +12245,7 @@
             <w:sdt>
               <w:sdtPr>
                 <w:lock w:val="contentLocked"/>
-                <w:id w:val="2078542427"/>
+                <w:id w:val="195152750"/>
                 <w:tag w:val="goog_rdk_169"/>
               </w:sdtPr>
               <w:sdtContent>
@@ -12242,7 +12296,7 @@
             <w:sdt>
               <w:sdtPr>
                 <w:lock w:val="contentLocked"/>
-                <w:id w:val="368801502"/>
+                <w:id w:val="1518170595"/>
                 <w:tag w:val="goog_rdk_170"/>
               </w:sdtPr>
               <w:sdtContent>
@@ -12294,7 +12348,7 @@
             <w:sdt>
               <w:sdtPr>
                 <w:lock w:val="contentLocked"/>
-                <w:id w:val="380947098"/>
+                <w:id w:val="580240092"/>
                 <w:tag w:val="goog_rdk_171"/>
               </w:sdtPr>
               <w:sdtContent>
@@ -12343,7 +12397,7 @@
             <w:sdt>
               <w:sdtPr>
                 <w:lock w:val="contentLocked"/>
-                <w:id w:val="258857374"/>
+                <w:id w:val="-116730150"/>
                 <w:tag w:val="goog_rdk_172"/>
               </w:sdtPr>
               <w:sdtContent>
@@ -12396,7 +12450,7 @@
             <w:sdt>
               <w:sdtPr>
                 <w:lock w:val="contentLocked"/>
-                <w:id w:val="1359352434"/>
+                <w:id w:val="-1762216664"/>
                 <w:tag w:val="goog_rdk_173"/>
               </w:sdtPr>
               <w:sdtContent>
@@ -12448,7 +12502,7 @@
             <w:sdt>
               <w:sdtPr>
                 <w:lock w:val="contentLocked"/>
-                <w:id w:val="-1367839804"/>
+                <w:id w:val="-1291825624"/>
                 <w:tag w:val="goog_rdk_174"/>
               </w:sdtPr>
               <w:sdtContent>
@@ -12506,7 +12560,7 @@
             <w:sdt>
               <w:sdtPr>
                 <w:lock w:val="contentLocked"/>
-                <w:id w:val="-685877049"/>
+                <w:id w:val="838523873"/>
                 <w:tag w:val="goog_rdk_175"/>
               </w:sdtPr>
               <w:sdtContent>
@@ -12557,7 +12611,7 @@
             <w:sdt>
               <w:sdtPr>
                 <w:lock w:val="contentLocked"/>
-                <w:id w:val="2029265930"/>
+                <w:id w:val="-1066243358"/>
                 <w:tag w:val="goog_rdk_176"/>
               </w:sdtPr>
               <w:sdtContent>
@@ -12609,7 +12663,7 @@
             <w:sdt>
               <w:sdtPr>
                 <w:lock w:val="contentLocked"/>
-                <w:id w:val="-2118094367"/>
+                <w:id w:val="-856263508"/>
                 <w:tag w:val="goog_rdk_177"/>
               </w:sdtPr>
               <w:sdtContent>
@@ -12658,7 +12712,7 @@
             <w:sdt>
               <w:sdtPr>
                 <w:lock w:val="contentLocked"/>
-                <w:id w:val="443480085"/>
+                <w:id w:val="-2081998054"/>
                 <w:tag w:val="goog_rdk_178"/>
               </w:sdtPr>
               <w:sdtContent>
@@ -12711,7 +12765,7 @@
             <w:sdt>
               <w:sdtPr>
                 <w:lock w:val="contentLocked"/>
-                <w:id w:val="800987503"/>
+                <w:id w:val="-145764640"/>
                 <w:tag w:val="goog_rdk_179"/>
               </w:sdtPr>
               <w:sdtContent>
@@ -12763,7 +12817,7 @@
             <w:sdt>
               <w:sdtPr>
                 <w:lock w:val="contentLocked"/>
-                <w:id w:val="-196656717"/>
+                <w:id w:val="1266131546"/>
                 <w:tag w:val="goog_rdk_180"/>
               </w:sdtPr>
               <w:sdtContent>
@@ -12821,7 +12875,7 @@
             <w:sdt>
               <w:sdtPr>
                 <w:lock w:val="contentLocked"/>
-                <w:id w:val="-392164612"/>
+                <w:id w:val="-1372709129"/>
                 <w:tag w:val="goog_rdk_181"/>
               </w:sdtPr>
               <w:sdtContent>
@@ -12872,7 +12926,7 @@
             <w:sdt>
               <w:sdtPr>
                 <w:lock w:val="contentLocked"/>
-                <w:id w:val="-1762753375"/>
+                <w:id w:val="-1690298099"/>
                 <w:tag w:val="goog_rdk_182"/>
               </w:sdtPr>
               <w:sdtContent>
@@ -12924,7 +12978,7 @@
             <w:sdt>
               <w:sdtPr>
                 <w:lock w:val="contentLocked"/>
-                <w:id w:val="38526980"/>
+                <w:id w:val="935471403"/>
                 <w:tag w:val="goog_rdk_183"/>
               </w:sdtPr>
               <w:sdtContent>
@@ -12973,7 +13027,7 @@
             <w:sdt>
               <w:sdtPr>
                 <w:lock w:val="contentLocked"/>
-                <w:id w:val="-146834254"/>
+                <w:id w:val="-1939338694"/>
                 <w:tag w:val="goog_rdk_184"/>
               </w:sdtPr>
               <w:sdtContent>
@@ -13026,7 +13080,7 @@
             <w:sdt>
               <w:sdtPr>
                 <w:lock w:val="contentLocked"/>
-                <w:id w:val="-2091891738"/>
+                <w:id w:val="-1973085003"/>
                 <w:tag w:val="goog_rdk_185"/>
               </w:sdtPr>
               <w:sdtContent>
@@ -13078,7 +13132,7 @@
             <w:sdt>
               <w:sdtPr>
                 <w:lock w:val="contentLocked"/>
-                <w:id w:val="455971741"/>
+                <w:id w:val="-590987885"/>
                 <w:tag w:val="goog_rdk_186"/>
               </w:sdtPr>
               <w:sdtContent>
@@ -13136,7 +13190,7 @@
             <w:sdt>
               <w:sdtPr>
                 <w:lock w:val="contentLocked"/>
-                <w:id w:val="-821807045"/>
+                <w:id w:val="-21287822"/>
                 <w:tag w:val="goog_rdk_187"/>
               </w:sdtPr>
               <w:sdtContent>
@@ -13187,7 +13241,7 @@
             <w:sdt>
               <w:sdtPr>
                 <w:lock w:val="contentLocked"/>
-                <w:id w:val="-455989433"/>
+                <w:id w:val="1620838237"/>
                 <w:tag w:val="goog_rdk_188"/>
               </w:sdtPr>
               <w:sdtContent>
@@ -13239,7 +13293,7 @@
             <w:sdt>
               <w:sdtPr>
                 <w:lock w:val="contentLocked"/>
-                <w:id w:val="-936479943"/>
+                <w:id w:val="1489813512"/>
                 <w:tag w:val="goog_rdk_189"/>
               </w:sdtPr>
               <w:sdtContent>
@@ -13288,7 +13342,7 @@
             <w:sdt>
               <w:sdtPr>
                 <w:lock w:val="contentLocked"/>
-                <w:id w:val="-465682235"/>
+                <w:id w:val="-1186452096"/>
                 <w:tag w:val="goog_rdk_190"/>
               </w:sdtPr>
               <w:sdtContent>
@@ -13341,7 +13395,7 @@
             <w:sdt>
               <w:sdtPr>
                 <w:lock w:val="contentLocked"/>
-                <w:id w:val="1052121582"/>
+                <w:id w:val="2145537338"/>
                 <w:tag w:val="goog_rdk_191"/>
               </w:sdtPr>
               <w:sdtContent>
@@ -13393,7 +13447,7 @@
             <w:sdt>
               <w:sdtPr>
                 <w:lock w:val="contentLocked"/>
-                <w:id w:val="-440556799"/>
+                <w:id w:val="-865224163"/>
                 <w:tag w:val="goog_rdk_192"/>
               </w:sdtPr>
               <w:sdtContent>
@@ -13451,7 +13505,7 @@
             <w:sdt>
               <w:sdtPr>
                 <w:lock w:val="contentLocked"/>
-                <w:id w:val="1831754496"/>
+                <w:id w:val="-451138497"/>
                 <w:tag w:val="goog_rdk_193"/>
               </w:sdtPr>
               <w:sdtContent>
@@ -13502,7 +13556,7 @@
             <w:sdt>
               <w:sdtPr>
                 <w:lock w:val="contentLocked"/>
-                <w:id w:val="-1516088707"/>
+                <w:id w:val="907684258"/>
                 <w:tag w:val="goog_rdk_194"/>
               </w:sdtPr>
               <w:sdtContent>
@@ -13554,7 +13608,7 @@
             <w:sdt>
               <w:sdtPr>
                 <w:lock w:val="contentLocked"/>
-                <w:id w:val="136490394"/>
+                <w:id w:val="-1904148058"/>
                 <w:tag w:val="goog_rdk_195"/>
               </w:sdtPr>
               <w:sdtContent>
@@ -13603,7 +13657,7 @@
             <w:sdt>
               <w:sdtPr>
                 <w:lock w:val="contentLocked"/>
-                <w:id w:val="1786641062"/>
+                <w:id w:val="1228517593"/>
                 <w:tag w:val="goog_rdk_196"/>
               </w:sdtPr>
               <w:sdtContent>
@@ -13656,7 +13710,7 @@
             <w:sdt>
               <w:sdtPr>
                 <w:lock w:val="contentLocked"/>
-                <w:id w:val="1931589537"/>
+                <w:id w:val="-992835056"/>
                 <w:tag w:val="goog_rdk_197"/>
               </w:sdtPr>
               <w:sdtContent>
@@ -13708,7 +13762,7 @@
             <w:sdt>
               <w:sdtPr>
                 <w:lock w:val="contentLocked"/>
-                <w:id w:val="-1524574124"/>
+                <w:id w:val="-1956673935"/>
                 <w:tag w:val="goog_rdk_198"/>
               </w:sdtPr>
               <w:sdtContent>
@@ -13766,7 +13820,7 @@
             <w:sdt>
               <w:sdtPr>
                 <w:lock w:val="contentLocked"/>
-                <w:id w:val="-488562281"/>
+                <w:id w:val="1461837993"/>
                 <w:tag w:val="goog_rdk_199"/>
               </w:sdtPr>
               <w:sdtContent>
@@ -13817,7 +13871,7 @@
             <w:sdt>
               <w:sdtPr>
                 <w:lock w:val="contentLocked"/>
-                <w:id w:val="1628178552"/>
+                <w:id w:val="-1898747463"/>
                 <w:tag w:val="goog_rdk_200"/>
               </w:sdtPr>
               <w:sdtContent>
@@ -13869,7 +13923,7 @@
             <w:sdt>
               <w:sdtPr>
                 <w:lock w:val="contentLocked"/>
-                <w:id w:val="-659236371"/>
+                <w:id w:val="1964609846"/>
                 <w:tag w:val="goog_rdk_201"/>
               </w:sdtPr>
               <w:sdtContent>
@@ -13918,7 +13972,7 @@
             <w:sdt>
               <w:sdtPr>
                 <w:lock w:val="contentLocked"/>
-                <w:id w:val="-1300275487"/>
+                <w:id w:val="-1355491306"/>
                 <w:tag w:val="goog_rdk_202"/>
               </w:sdtPr>
               <w:sdtContent>
@@ -13971,7 +14025,7 @@
             <w:sdt>
               <w:sdtPr>
                 <w:lock w:val="contentLocked"/>
-                <w:id w:val="-1908896469"/>
+                <w:id w:val="159714963"/>
                 <w:tag w:val="goog_rdk_203"/>
               </w:sdtPr>
               <w:sdtContent>
@@ -14023,7 +14077,7 @@
             <w:sdt>
               <w:sdtPr>
                 <w:lock w:val="contentLocked"/>
-                <w:id w:val="925446386"/>
+                <w:id w:val="1159177634"/>
                 <w:tag w:val="goog_rdk_204"/>
               </w:sdtPr>
               <w:sdtContent>
@@ -14081,7 +14135,7 @@
             <w:sdt>
               <w:sdtPr>
                 <w:lock w:val="contentLocked"/>
-                <w:id w:val="-1330490056"/>
+                <w:id w:val="-687711355"/>
                 <w:tag w:val="goog_rdk_205"/>
               </w:sdtPr>
               <w:sdtContent>
@@ -14132,7 +14186,7 @@
             <w:sdt>
               <w:sdtPr>
                 <w:lock w:val="contentLocked"/>
-                <w:id w:val="-1644122893"/>
+                <w:id w:val="453307661"/>
                 <w:tag w:val="goog_rdk_206"/>
               </w:sdtPr>
               <w:sdtContent>
@@ -14184,7 +14238,7 @@
             <w:sdt>
               <w:sdtPr>
                 <w:lock w:val="contentLocked"/>
-                <w:id w:val="-1901992372"/>
+                <w:id w:val="172228085"/>
                 <w:tag w:val="goog_rdk_207"/>
               </w:sdtPr>
               <w:sdtContent>
@@ -14233,7 +14287,7 @@
             <w:sdt>
               <w:sdtPr>
                 <w:lock w:val="contentLocked"/>
-                <w:id w:val="1480174317"/>
+                <w:id w:val="898009827"/>
                 <w:tag w:val="goog_rdk_208"/>
               </w:sdtPr>
               <w:sdtContent>
@@ -14286,7 +14340,7 @@
             <w:sdt>
               <w:sdtPr>
                 <w:lock w:val="contentLocked"/>
-                <w:id w:val="2002762556"/>
+                <w:id w:val="2098630290"/>
                 <w:tag w:val="goog_rdk_209"/>
               </w:sdtPr>
               <w:sdtContent>
@@ -14338,7 +14392,7 @@
             <w:sdt>
               <w:sdtPr>
                 <w:lock w:val="contentLocked"/>
-                <w:id w:val="-1966402011"/>
+                <w:id w:val="-1215129630"/>
                 <w:tag w:val="goog_rdk_210"/>
               </w:sdtPr>
               <w:sdtContent>
@@ -14396,7 +14450,7 @@
             <w:sdt>
               <w:sdtPr>
                 <w:lock w:val="contentLocked"/>
-                <w:id w:val="686032353"/>
+                <w:id w:val="348027932"/>
                 <w:tag w:val="goog_rdk_211"/>
               </w:sdtPr>
               <w:sdtContent>
@@ -14437,7 +14491,7 @@
             <w:sdt>
               <w:sdtPr>
                 <w:lock w:val="contentLocked"/>
-                <w:id w:val="-202418544"/>
+                <w:id w:val="-401631414"/>
                 <w:tag w:val="goog_rdk_212"/>
               </w:sdtPr>
               <w:sdtContent>
@@ -14478,7 +14532,7 @@
             <w:sdt>
               <w:sdtPr>
                 <w:lock w:val="contentLocked"/>
-                <w:id w:val="1795516580"/>
+                <w:id w:val="-495464369"/>
                 <w:tag w:val="goog_rdk_213"/>
               </w:sdtPr>
               <w:sdtContent>
@@ -14531,7 +14585,7 @@
             <w:sdt>
               <w:sdtPr>
                 <w:lock w:val="contentLocked"/>
-                <w:id w:val="1016617627"/>
+                <w:id w:val="595675821"/>
                 <w:tag w:val="goog_rdk_214"/>
               </w:sdtPr>
               <w:sdtContent>
@@ -14584,7 +14638,7 @@
             <w:sdt>
               <w:sdtPr>
                 <w:lock w:val="contentLocked"/>
-                <w:id w:val="1308343175"/>
+                <w:id w:val="1865093329"/>
                 <w:tag w:val="goog_rdk_215"/>
               </w:sdtPr>
               <w:sdtContent>
@@ -14637,7 +14691,7 @@
             <w:sdt>
               <w:sdtPr>
                 <w:lock w:val="contentLocked"/>
-                <w:id w:val="-2126043141"/>
+                <w:id w:val="293167881"/>
                 <w:tag w:val="goog_rdk_216"/>
               </w:sdtPr>
               <w:sdtContent>
@@ -14697,7 +14751,7 @@
             <w:sdt>
               <w:sdtPr>
                 <w:lock w:val="contentLocked"/>
-                <w:id w:val="1542677010"/>
+                <w:id w:val="-1324905133"/>
                 <w:tag w:val="goog_rdk_217"/>
               </w:sdtPr>
               <w:sdtContent>
@@ -14738,7 +14792,7 @@
             <w:sdt>
               <w:sdtPr>
                 <w:lock w:val="contentLocked"/>
-                <w:id w:val="1246828357"/>
+                <w:id w:val="2003206206"/>
                 <w:tag w:val="goog_rdk_218"/>
               </w:sdtPr>
               <w:sdtContent>
@@ -14779,7 +14833,7 @@
             <w:sdt>
               <w:sdtPr>
                 <w:lock w:val="contentLocked"/>
-                <w:id w:val="-1623067727"/>
+                <w:id w:val="-203117438"/>
                 <w:tag w:val="goog_rdk_219"/>
               </w:sdtPr>
               <w:sdtContent>
@@ -14820,7 +14874,7 @@
             <w:sdt>
               <w:sdtPr>
                 <w:lock w:val="contentLocked"/>
-                <w:id w:val="-1617224242"/>
+                <w:id w:val="-586206504"/>
                 <w:tag w:val="goog_rdk_220"/>
               </w:sdtPr>
               <w:sdtContent>
@@ -14861,7 +14915,7 @@
             <w:sdt>
               <w:sdtPr>
                 <w:lock w:val="contentLocked"/>
-                <w:id w:val="-527089808"/>
+                <w:id w:val="-1320087234"/>
                 <w:tag w:val="goog_rdk_221"/>
               </w:sdtPr>
               <w:sdtContent>
@@ -14902,7 +14956,7 @@
             <w:sdt>
               <w:sdtPr>
                 <w:lock w:val="contentLocked"/>
-                <w:id w:val="-243939381"/>
+                <w:id w:val="1101920154"/>
                 <w:tag w:val="goog_rdk_222"/>
               </w:sdtPr>
               <w:sdtContent>
@@ -14950,7 +15004,7 @@
             <w:sdt>
               <w:sdtPr>
                 <w:lock w:val="contentLocked"/>
-                <w:id w:val="1854007681"/>
+                <w:id w:val="1011852896"/>
                 <w:tag w:val="goog_rdk_223"/>
               </w:sdtPr>
               <w:sdtContent>
@@ -15001,7 +15055,7 @@
             <w:sdt>
               <w:sdtPr>
                 <w:lock w:val="contentLocked"/>
-                <w:id w:val="544691286"/>
+                <w:id w:val="-1277509989"/>
                 <w:tag w:val="goog_rdk_226"/>
               </w:sdtPr>
               <w:sdtContent>
@@ -15052,7 +15106,7 @@
             <w:sdt>
               <w:sdtPr>
                 <w:lock w:val="contentLocked"/>
-                <w:id w:val="-1578013081"/>
+                <w:id w:val="-1427109091"/>
                 <w:tag w:val="goog_rdk_227"/>
               </w:sdtPr>
               <w:sdtContent>
@@ -15103,7 +15157,7 @@
             <w:sdt>
               <w:sdtPr>
                 <w:lock w:val="contentLocked"/>
-                <w:id w:val="-1380159659"/>
+                <w:id w:val="-1408405268"/>
                 <w:tag w:val="goog_rdk_228"/>
               </w:sdtPr>
               <w:sdtContent>
@@ -15195,7 +15249,7 @@
     <w:sdt>
       <w:sdtPr>
         <w:lock w:val="contentLocked"/>
-        <w:id w:val="148843274"/>
+        <w:id w:val="720955096"/>
         <w:tag w:val="goog_rdk_381"/>
       </w:sdtPr>
       <w:sdtContent>
@@ -15240,7 +15294,7 @@
             <w:sdt>
               <w:sdtPr>
                 <w:lock w:val="contentLocked"/>
-                <w:id w:val="811676951"/>
+                <w:id w:val="-504427623"/>
                 <w:tag w:val="goog_rdk_230"/>
               </w:sdtPr>
               <w:sdtContent>
@@ -15301,7 +15355,7 @@
             <w:sdt>
               <w:sdtPr>
                 <w:lock w:val="contentLocked"/>
-                <w:id w:val="2098944518"/>
+                <w:id w:val="-1049699105"/>
                 <w:tag w:val="goog_rdk_235"/>
               </w:sdtPr>
               <w:sdtContent>
@@ -15360,7 +15414,7 @@
             <w:sdt>
               <w:sdtPr>
                 <w:lock w:val="contentLocked"/>
-                <w:id w:val="1179547959"/>
+                <w:id w:val="-1548165963"/>
                 <w:tag w:val="goog_rdk_240"/>
               </w:sdtPr>
               <w:sdtContent>
@@ -15413,7 +15467,7 @@
             <w:sdt>
               <w:sdtPr>
                 <w:lock w:val="contentLocked"/>
-                <w:id w:val="-1582906659"/>
+                <w:id w:val="1665262175"/>
                 <w:tag w:val="goog_rdk_241"/>
               </w:sdtPr>
               <w:sdtContent>
@@ -15466,7 +15520,7 @@
             <w:sdt>
               <w:sdtPr>
                 <w:lock w:val="contentLocked"/>
-                <w:id w:val="838484509"/>
+                <w:id w:val="1804487198"/>
                 <w:tag w:val="goog_rdk_242"/>
               </w:sdtPr>
               <w:sdtContent>
@@ -15519,7 +15573,7 @@
             <w:sdt>
               <w:sdtPr>
                 <w:lock w:val="contentLocked"/>
-                <w:id w:val="-1686243513"/>
+                <w:id w:val="-995225713"/>
                 <w:tag w:val="goog_rdk_243"/>
               </w:sdtPr>
               <w:sdtContent>
@@ -15572,7 +15626,7 @@
             <w:sdt>
               <w:sdtPr>
                 <w:lock w:val="contentLocked"/>
-                <w:id w:val="-830881208"/>
+                <w:id w:val="1769737372"/>
                 <w:tag w:val="goog_rdk_244"/>
               </w:sdtPr>
               <w:sdtContent>
@@ -15632,7 +15686,7 @@
             <w:sdt>
               <w:sdtPr>
                 <w:lock w:val="contentLocked"/>
-                <w:id w:val="-679870680"/>
+                <w:id w:val="-1197109791"/>
                 <w:tag w:val="goog_rdk_245"/>
               </w:sdtPr>
               <w:sdtContent>
@@ -15682,7 +15736,7 @@
             <w:sdt>
               <w:sdtPr>
                 <w:lock w:val="contentLocked"/>
-                <w:id w:val="105723356"/>
+                <w:id w:val="389964469"/>
                 <w:tag w:val="goog_rdk_246"/>
               </w:sdtPr>
               <w:sdtContent>
@@ -15731,7 +15785,7 @@
             <w:sdt>
               <w:sdtPr>
                 <w:lock w:val="contentLocked"/>
-                <w:id w:val="29324134"/>
+                <w:id w:val="-258017244"/>
                 <w:tag w:val="goog_rdk_247"/>
               </w:sdtPr>
               <w:sdtContent>
@@ -15784,7 +15838,7 @@
             <w:sdt>
               <w:sdtPr>
                 <w:lock w:val="contentLocked"/>
-                <w:id w:val="790893030"/>
+                <w:id w:val="-821970991"/>
                 <w:tag w:val="goog_rdk_248"/>
               </w:sdtPr>
               <w:sdtContent>
@@ -15836,7 +15890,7 @@
             <w:sdt>
               <w:sdtPr>
                 <w:lock w:val="contentLocked"/>
-                <w:id w:val="710358012"/>
+                <w:id w:val="-1626910140"/>
                 <w:tag w:val="goog_rdk_249"/>
               </w:sdtPr>
               <w:sdtContent>
@@ -15894,7 +15948,7 @@
             <w:sdt>
               <w:sdtPr>
                 <w:lock w:val="contentLocked"/>
-                <w:id w:val="595358446"/>
+                <w:id w:val="-441054581"/>
                 <w:tag w:val="goog_rdk_250"/>
               </w:sdtPr>
               <w:sdtContent>
@@ -15926,7 +15980,7 @@
                     </w:pPr>
                     <w:sdt>
                       <w:sdtPr>
-                        <w:id w:val="857473402"/>
+                        <w:id w:val="-1341114448"/>
                         <w:tag w:val="goog_rdk_251"/>
                       </w:sdtPr>
                       <w:sdtContent>
@@ -15955,7 +16009,7 @@
             <w:sdt>
               <w:sdtPr>
                 <w:lock w:val="contentLocked"/>
-                <w:id w:val="1154364452"/>
+                <w:id w:val="2080416637"/>
                 <w:tag w:val="goog_rdk_252"/>
               </w:sdtPr>
               <w:sdtContent>
@@ -16006,7 +16060,7 @@
             <w:sdt>
               <w:sdtPr>
                 <w:lock w:val="contentLocked"/>
-                <w:id w:val="899111911"/>
+                <w:id w:val="1980109567"/>
                 <w:tag w:val="goog_rdk_253"/>
               </w:sdtPr>
               <w:sdtContent>
@@ -16059,7 +16113,7 @@
             <w:sdt>
               <w:sdtPr>
                 <w:lock w:val="contentLocked"/>
-                <w:id w:val="-1927700979"/>
+                <w:id w:val="997155147"/>
                 <w:tag w:val="goog_rdk_254"/>
               </w:sdtPr>
               <w:sdtContent>
@@ -16111,7 +16165,7 @@
             <w:sdt>
               <w:sdtPr>
                 <w:lock w:val="contentLocked"/>
-                <w:id w:val="2066585034"/>
+                <w:id w:val="650649825"/>
                 <w:tag w:val="goog_rdk_255"/>
               </w:sdtPr>
               <w:sdtContent>
@@ -16169,7 +16223,7 @@
             <w:sdt>
               <w:sdtPr>
                 <w:lock w:val="contentLocked"/>
-                <w:id w:val="-278983473"/>
+                <w:id w:val="-1402603975"/>
                 <w:tag w:val="goog_rdk_256"/>
               </w:sdtPr>
               <w:sdtContent>
@@ -16219,7 +16273,7 @@
             <w:sdt>
               <w:sdtPr>
                 <w:lock w:val="contentLocked"/>
-                <w:id w:val="1004676588"/>
+                <w:id w:val="1257204793"/>
                 <w:tag w:val="goog_rdk_257"/>
               </w:sdtPr>
               <w:sdtContent>
@@ -16268,7 +16322,7 @@
             <w:sdt>
               <w:sdtPr>
                 <w:lock w:val="contentLocked"/>
-                <w:id w:val="483276902"/>
+                <w:id w:val="-31171716"/>
                 <w:tag w:val="goog_rdk_258"/>
               </w:sdtPr>
               <w:sdtContent>
@@ -16321,7 +16375,7 @@
             <w:sdt>
               <w:sdtPr>
                 <w:lock w:val="contentLocked"/>
-                <w:id w:val="926053704"/>
+                <w:id w:val="1343979106"/>
                 <w:tag w:val="goog_rdk_259"/>
               </w:sdtPr>
               <w:sdtContent>
@@ -16373,7 +16427,7 @@
             <w:sdt>
               <w:sdtPr>
                 <w:lock w:val="contentLocked"/>
-                <w:id w:val="-139382580"/>
+                <w:id w:val="558034333"/>
                 <w:tag w:val="goog_rdk_260"/>
               </w:sdtPr>
               <w:sdtContent>
@@ -16431,7 +16485,7 @@
             <w:sdt>
               <w:sdtPr>
                 <w:lock w:val="contentLocked"/>
-                <w:id w:val="104235468"/>
+                <w:id w:val="-482940811"/>
                 <w:tag w:val="goog_rdk_261"/>
               </w:sdtPr>
               <w:sdtContent>
@@ -16481,7 +16535,7 @@
             <w:sdt>
               <w:sdtPr>
                 <w:lock w:val="contentLocked"/>
-                <w:id w:val="-1634349195"/>
+                <w:id w:val="-547693063"/>
                 <w:tag w:val="goog_rdk_262"/>
               </w:sdtPr>
               <w:sdtContent>
@@ -16530,7 +16584,7 @@
             <w:sdt>
               <w:sdtPr>
                 <w:lock w:val="contentLocked"/>
-                <w:id w:val="-611944550"/>
+                <w:id w:val="-460591334"/>
                 <w:tag w:val="goog_rdk_263"/>
               </w:sdtPr>
               <w:sdtContent>
@@ -16583,7 +16637,7 @@
             <w:sdt>
               <w:sdtPr>
                 <w:lock w:val="contentLocked"/>
-                <w:id w:val="587926790"/>
+                <w:id w:val="500064243"/>
                 <w:tag w:val="goog_rdk_264"/>
               </w:sdtPr>
               <w:sdtContent>
@@ -16635,7 +16689,7 @@
             <w:sdt>
               <w:sdtPr>
                 <w:lock w:val="contentLocked"/>
-                <w:id w:val="-1043841664"/>
+                <w:id w:val="-2127722500"/>
                 <w:tag w:val="goog_rdk_265"/>
               </w:sdtPr>
               <w:sdtContent>
@@ -16693,7 +16747,7 @@
             <w:sdt>
               <w:sdtPr>
                 <w:lock w:val="contentLocked"/>
-                <w:id w:val="-626891590"/>
+                <w:id w:val="-1289156588"/>
                 <w:tag w:val="goog_rdk_266"/>
               </w:sdtPr>
               <w:sdtContent>
@@ -16743,7 +16797,7 @@
             <w:sdt>
               <w:sdtPr>
                 <w:lock w:val="contentLocked"/>
-                <w:id w:val="-1601457109"/>
+                <w:id w:val="379860219"/>
                 <w:tag w:val="goog_rdk_267"/>
               </w:sdtPr>
               <w:sdtContent>
@@ -16792,7 +16846,7 @@
             <w:sdt>
               <w:sdtPr>
                 <w:lock w:val="contentLocked"/>
-                <w:id w:val="-1320968095"/>
+                <w:id w:val="1361316994"/>
                 <w:tag w:val="goog_rdk_268"/>
               </w:sdtPr>
               <w:sdtContent>
@@ -16845,7 +16899,7 @@
             <w:sdt>
               <w:sdtPr>
                 <w:lock w:val="contentLocked"/>
-                <w:id w:val="1548005298"/>
+                <w:id w:val="749966913"/>
                 <w:tag w:val="goog_rdk_269"/>
               </w:sdtPr>
               <w:sdtContent>
@@ -16897,7 +16951,7 @@
             <w:sdt>
               <w:sdtPr>
                 <w:lock w:val="contentLocked"/>
-                <w:id w:val="-605831782"/>
+                <w:id w:val="1843485656"/>
                 <w:tag w:val="goog_rdk_270"/>
               </w:sdtPr>
               <w:sdtContent>
@@ -16955,7 +17009,7 @@
             <w:sdt>
               <w:sdtPr>
                 <w:lock w:val="contentLocked"/>
-                <w:id w:val="899541428"/>
+                <w:id w:val="-116996351"/>
                 <w:tag w:val="goog_rdk_271"/>
               </w:sdtPr>
               <w:sdtContent>
@@ -17005,7 +17059,7 @@
             <w:sdt>
               <w:sdtPr>
                 <w:lock w:val="contentLocked"/>
-                <w:id w:val="-1735015564"/>
+                <w:id w:val="950780273"/>
                 <w:tag w:val="goog_rdk_272"/>
               </w:sdtPr>
               <w:sdtContent>
@@ -17054,7 +17108,7 @@
             <w:sdt>
               <w:sdtPr>
                 <w:lock w:val="contentLocked"/>
-                <w:id w:val="2119202533"/>
+                <w:id w:val="115266233"/>
                 <w:tag w:val="goog_rdk_273"/>
               </w:sdtPr>
               <w:sdtContent>
@@ -17107,7 +17161,7 @@
             <w:sdt>
               <w:sdtPr>
                 <w:lock w:val="contentLocked"/>
-                <w:id w:val="1190573156"/>
+                <w:id w:val="1622771490"/>
                 <w:tag w:val="goog_rdk_274"/>
               </w:sdtPr>
               <w:sdtContent>
@@ -17159,7 +17213,7 @@
             <w:sdt>
               <w:sdtPr>
                 <w:lock w:val="contentLocked"/>
-                <w:id w:val="-228622186"/>
+                <w:id w:val="-759177060"/>
                 <w:tag w:val="goog_rdk_275"/>
               </w:sdtPr>
               <w:sdtContent>
@@ -17217,7 +17271,7 @@
             <w:sdt>
               <w:sdtPr>
                 <w:lock w:val="contentLocked"/>
-                <w:id w:val="1885601977"/>
+                <w:id w:val="1515342687"/>
                 <w:tag w:val="goog_rdk_276"/>
               </w:sdtPr>
               <w:sdtContent>
@@ -17267,7 +17321,7 @@
             <w:sdt>
               <w:sdtPr>
                 <w:lock w:val="contentLocked"/>
-                <w:id w:val="-1404025826"/>
+                <w:id w:val="1422844677"/>
                 <w:tag w:val="goog_rdk_277"/>
               </w:sdtPr>
               <w:sdtContent>
@@ -17316,7 +17370,7 @@
             <w:sdt>
               <w:sdtPr>
                 <w:lock w:val="contentLocked"/>
-                <w:id w:val="1417549622"/>
+                <w:id w:val="1737490100"/>
                 <w:tag w:val="goog_rdk_278"/>
               </w:sdtPr>
               <w:sdtContent>
@@ -17369,7 +17423,7 @@
             <w:sdt>
               <w:sdtPr>
                 <w:lock w:val="contentLocked"/>
-                <w:id w:val="770875743"/>
+                <w:id w:val="-1923424691"/>
                 <w:tag w:val="goog_rdk_279"/>
               </w:sdtPr>
               <w:sdtContent>
@@ -17421,7 +17475,7 @@
             <w:sdt>
               <w:sdtPr>
                 <w:lock w:val="contentLocked"/>
-                <w:id w:val="577699510"/>
+                <w:id w:val="-1325516282"/>
                 <w:tag w:val="goog_rdk_280"/>
               </w:sdtPr>
               <w:sdtContent>
@@ -17479,7 +17533,7 @@
             <w:sdt>
               <w:sdtPr>
                 <w:lock w:val="contentLocked"/>
-                <w:id w:val="1171175369"/>
+                <w:id w:val="2066357888"/>
                 <w:tag w:val="goog_rdk_281"/>
               </w:sdtPr>
               <w:sdtContent>
@@ -17529,7 +17583,7 @@
             <w:sdt>
               <w:sdtPr>
                 <w:lock w:val="contentLocked"/>
-                <w:id w:val="1015486810"/>
+                <w:id w:val="1591372005"/>
                 <w:tag w:val="goog_rdk_282"/>
               </w:sdtPr>
               <w:sdtContent>
@@ -17578,7 +17632,7 @@
             <w:sdt>
               <w:sdtPr>
                 <w:lock w:val="contentLocked"/>
-                <w:id w:val="1737512969"/>
+                <w:id w:val="1406463489"/>
                 <w:tag w:val="goog_rdk_283"/>
               </w:sdtPr>
               <w:sdtContent>
@@ -17631,7 +17685,7 @@
             <w:sdt>
               <w:sdtPr>
                 <w:lock w:val="contentLocked"/>
-                <w:id w:val="675313159"/>
+                <w:id w:val="-924159669"/>
                 <w:tag w:val="goog_rdk_284"/>
               </w:sdtPr>
               <w:sdtContent>
@@ -17683,7 +17737,7 @@
             <w:sdt>
               <w:sdtPr>
                 <w:lock w:val="contentLocked"/>
-                <w:id w:val="336678568"/>
+                <w:id w:val="419209574"/>
                 <w:tag w:val="goog_rdk_285"/>
               </w:sdtPr>
               <w:sdtContent>
@@ -17741,7 +17795,7 @@
             <w:sdt>
               <w:sdtPr>
                 <w:lock w:val="contentLocked"/>
-                <w:id w:val="853234740"/>
+                <w:id w:val="1342625896"/>
                 <w:tag w:val="goog_rdk_286"/>
               </w:sdtPr>
               <w:sdtContent>
@@ -17791,7 +17845,7 @@
             <w:sdt>
               <w:sdtPr>
                 <w:lock w:val="contentLocked"/>
-                <w:id w:val="674220317"/>
+                <w:id w:val="-2100884477"/>
                 <w:tag w:val="goog_rdk_287"/>
               </w:sdtPr>
               <w:sdtContent>
@@ -17840,7 +17894,7 @@
             <w:sdt>
               <w:sdtPr>
                 <w:lock w:val="contentLocked"/>
-                <w:id w:val="1355594931"/>
+                <w:id w:val="1422953639"/>
                 <w:tag w:val="goog_rdk_288"/>
               </w:sdtPr>
               <w:sdtContent>
@@ -17893,7 +17947,7 @@
             <w:sdt>
               <w:sdtPr>
                 <w:lock w:val="contentLocked"/>
-                <w:id w:val="-659661421"/>
+                <w:id w:val="-839666714"/>
                 <w:tag w:val="goog_rdk_289"/>
               </w:sdtPr>
               <w:sdtContent>
@@ -17945,7 +17999,7 @@
             <w:sdt>
               <w:sdtPr>
                 <w:lock w:val="contentLocked"/>
-                <w:id w:val="1851938496"/>
+                <w:id w:val="-2116430440"/>
                 <w:tag w:val="goog_rdk_290"/>
               </w:sdtPr>
               <w:sdtContent>
@@ -18003,7 +18057,7 @@
             <w:sdt>
               <w:sdtPr>
                 <w:lock w:val="contentLocked"/>
-                <w:id w:val="154105143"/>
+                <w:id w:val="-77507896"/>
                 <w:tag w:val="goog_rdk_291"/>
               </w:sdtPr>
               <w:sdtContent>
@@ -18053,7 +18107,7 @@
             <w:sdt>
               <w:sdtPr>
                 <w:lock w:val="contentLocked"/>
-                <w:id w:val="-930292926"/>
+                <w:id w:val="2014122190"/>
                 <w:tag w:val="goog_rdk_292"/>
               </w:sdtPr>
               <w:sdtContent>
@@ -18102,7 +18156,7 @@
             <w:sdt>
               <w:sdtPr>
                 <w:lock w:val="contentLocked"/>
-                <w:id w:val="-717873528"/>
+                <w:id w:val="-47218300"/>
                 <w:tag w:val="goog_rdk_293"/>
               </w:sdtPr>
               <w:sdtContent>
@@ -18155,7 +18209,7 @@
             <w:sdt>
               <w:sdtPr>
                 <w:lock w:val="contentLocked"/>
-                <w:id w:val="401917800"/>
+                <w:id w:val="26426026"/>
                 <w:tag w:val="goog_rdk_294"/>
               </w:sdtPr>
               <w:sdtContent>
@@ -18207,7 +18261,7 @@
             <w:sdt>
               <w:sdtPr>
                 <w:lock w:val="contentLocked"/>
-                <w:id w:val="405966431"/>
+                <w:id w:val="-1005479854"/>
                 <w:tag w:val="goog_rdk_295"/>
               </w:sdtPr>
               <w:sdtContent>
@@ -18265,7 +18319,7 @@
             <w:sdt>
               <w:sdtPr>
                 <w:lock w:val="contentLocked"/>
-                <w:id w:val="1687369974"/>
+                <w:id w:val="-1658360034"/>
                 <w:tag w:val="goog_rdk_296"/>
               </w:sdtPr>
               <w:sdtContent>
@@ -18315,7 +18369,7 @@
             <w:sdt>
               <w:sdtPr>
                 <w:lock w:val="contentLocked"/>
-                <w:id w:val="-1790915157"/>
+                <w:id w:val="186982204"/>
                 <w:tag w:val="goog_rdk_297"/>
               </w:sdtPr>
               <w:sdtContent>
@@ -18364,7 +18418,7 @@
             <w:sdt>
               <w:sdtPr>
                 <w:lock w:val="contentLocked"/>
-                <w:id w:val="1732448979"/>
+                <w:id w:val="1222892643"/>
                 <w:tag w:val="goog_rdk_298"/>
               </w:sdtPr>
               <w:sdtContent>
@@ -18417,7 +18471,7 @@
             <w:sdt>
               <w:sdtPr>
                 <w:lock w:val="contentLocked"/>
-                <w:id w:val="-458990242"/>
+                <w:id w:val="-1561371259"/>
                 <w:tag w:val="goog_rdk_299"/>
               </w:sdtPr>
               <w:sdtContent>
@@ -18469,7 +18523,7 @@
             <w:sdt>
               <w:sdtPr>
                 <w:lock w:val="contentLocked"/>
-                <w:id w:val="-10694408"/>
+                <w:id w:val="1936185092"/>
                 <w:tag w:val="goog_rdk_300"/>
               </w:sdtPr>
               <w:sdtContent>
@@ -18527,7 +18581,7 @@
             <w:sdt>
               <w:sdtPr>
                 <w:lock w:val="contentLocked"/>
-                <w:id w:val="1551094756"/>
+                <w:id w:val="709550378"/>
                 <w:tag w:val="goog_rdk_301"/>
               </w:sdtPr>
               <w:sdtContent>
@@ -18577,7 +18631,7 @@
             <w:sdt>
               <w:sdtPr>
                 <w:lock w:val="contentLocked"/>
-                <w:id w:val="-1498305110"/>
+                <w:id w:val="1543374440"/>
                 <w:tag w:val="goog_rdk_302"/>
               </w:sdtPr>
               <w:sdtContent>
@@ -18626,7 +18680,7 @@
             <w:sdt>
               <w:sdtPr>
                 <w:lock w:val="contentLocked"/>
-                <w:id w:val="-543968299"/>
+                <w:id w:val="122096764"/>
                 <w:tag w:val="goog_rdk_303"/>
               </w:sdtPr>
               <w:sdtContent>
@@ -18679,7 +18733,7 @@
             <w:sdt>
               <w:sdtPr>
                 <w:lock w:val="contentLocked"/>
-                <w:id w:val="207682941"/>
+                <w:id w:val="-1721443717"/>
                 <w:tag w:val="goog_rdk_304"/>
               </w:sdtPr>
               <w:sdtContent>
@@ -18731,7 +18785,7 @@
             <w:sdt>
               <w:sdtPr>
                 <w:lock w:val="contentLocked"/>
-                <w:id w:val="2052064663"/>
+                <w:id w:val="-947322236"/>
                 <w:tag w:val="goog_rdk_305"/>
               </w:sdtPr>
               <w:sdtContent>
@@ -18789,7 +18843,7 @@
             <w:sdt>
               <w:sdtPr>
                 <w:lock w:val="contentLocked"/>
-                <w:id w:val="1363993868"/>
+                <w:id w:val="441107397"/>
                 <w:tag w:val="goog_rdk_306"/>
               </w:sdtPr>
               <w:sdtContent>
@@ -18839,7 +18893,7 @@
             <w:sdt>
               <w:sdtPr>
                 <w:lock w:val="contentLocked"/>
-                <w:id w:val="1524134758"/>
+                <w:id w:val="685671958"/>
                 <w:tag w:val="goog_rdk_307"/>
               </w:sdtPr>
               <w:sdtContent>
@@ -18888,7 +18942,7 @@
             <w:sdt>
               <w:sdtPr>
                 <w:lock w:val="contentLocked"/>
-                <w:id w:val="1705102861"/>
+                <w:id w:val="-1917657827"/>
                 <w:tag w:val="goog_rdk_308"/>
               </w:sdtPr>
               <w:sdtContent>
@@ -18941,7 +18995,7 @@
             <w:sdt>
               <w:sdtPr>
                 <w:lock w:val="contentLocked"/>
-                <w:id w:val="1843064334"/>
+                <w:id w:val="212376370"/>
                 <w:tag w:val="goog_rdk_309"/>
               </w:sdtPr>
               <w:sdtContent>
@@ -18993,7 +19047,7 @@
             <w:sdt>
               <w:sdtPr>
                 <w:lock w:val="contentLocked"/>
-                <w:id w:val="3554874"/>
+                <w:id w:val="-2087847047"/>
                 <w:tag w:val="goog_rdk_310"/>
               </w:sdtPr>
               <w:sdtContent>
@@ -19051,7 +19105,7 @@
             <w:sdt>
               <w:sdtPr>
                 <w:lock w:val="contentLocked"/>
-                <w:id w:val="1622482919"/>
+                <w:id w:val="-1127415109"/>
                 <w:tag w:val="goog_rdk_311"/>
               </w:sdtPr>
               <w:sdtContent>
@@ -19101,7 +19155,7 @@
             <w:sdt>
               <w:sdtPr>
                 <w:lock w:val="contentLocked"/>
-                <w:id w:val="-1128336813"/>
+                <w:id w:val="-1172350260"/>
                 <w:tag w:val="goog_rdk_312"/>
               </w:sdtPr>
               <w:sdtContent>
@@ -19150,7 +19204,7 @@
             <w:sdt>
               <w:sdtPr>
                 <w:lock w:val="contentLocked"/>
-                <w:id w:val="863317052"/>
+                <w:id w:val="-1136990795"/>
                 <w:tag w:val="goog_rdk_313"/>
               </w:sdtPr>
               <w:sdtContent>
@@ -19203,7 +19257,7 @@
             <w:sdt>
               <w:sdtPr>
                 <w:lock w:val="contentLocked"/>
-                <w:id w:val="1731028942"/>
+                <w:id w:val="1652775273"/>
                 <w:tag w:val="goog_rdk_314"/>
               </w:sdtPr>
               <w:sdtContent>
@@ -19255,7 +19309,7 @@
             <w:sdt>
               <w:sdtPr>
                 <w:lock w:val="contentLocked"/>
-                <w:id w:val="-781810191"/>
+                <w:id w:val="16793135"/>
                 <w:tag w:val="goog_rdk_315"/>
               </w:sdtPr>
               <w:sdtContent>
@@ -19313,7 +19367,7 @@
             <w:sdt>
               <w:sdtPr>
                 <w:lock w:val="contentLocked"/>
-                <w:id w:val="122499153"/>
+                <w:id w:val="-786303293"/>
                 <w:tag w:val="goog_rdk_316"/>
               </w:sdtPr>
               <w:sdtContent>
@@ -19363,7 +19417,7 @@
             <w:sdt>
               <w:sdtPr>
                 <w:lock w:val="contentLocked"/>
-                <w:id w:val="1332731377"/>
+                <w:id w:val="-541927599"/>
                 <w:tag w:val="goog_rdk_317"/>
               </w:sdtPr>
               <w:sdtContent>
@@ -19412,7 +19466,7 @@
             <w:sdt>
               <w:sdtPr>
                 <w:lock w:val="contentLocked"/>
-                <w:id w:val="840350325"/>
+                <w:id w:val="624822642"/>
                 <w:tag w:val="goog_rdk_318"/>
               </w:sdtPr>
               <w:sdtContent>
@@ -19465,7 +19519,7 @@
             <w:sdt>
               <w:sdtPr>
                 <w:lock w:val="contentLocked"/>
-                <w:id w:val="-1336709781"/>
+                <w:id w:val="684259178"/>
                 <w:tag w:val="goog_rdk_319"/>
               </w:sdtPr>
               <w:sdtContent>
@@ -19517,7 +19571,7 @@
             <w:sdt>
               <w:sdtPr>
                 <w:lock w:val="contentLocked"/>
-                <w:id w:val="-1267437994"/>
+                <w:id w:val="1080909833"/>
                 <w:tag w:val="goog_rdk_320"/>
               </w:sdtPr>
               <w:sdtContent>
@@ -19575,7 +19629,7 @@
             <w:sdt>
               <w:sdtPr>
                 <w:lock w:val="contentLocked"/>
-                <w:id w:val="674438921"/>
+                <w:id w:val="1571489062"/>
                 <w:tag w:val="goog_rdk_321"/>
               </w:sdtPr>
               <w:sdtContent>
@@ -19625,7 +19679,7 @@
             <w:sdt>
               <w:sdtPr>
                 <w:lock w:val="contentLocked"/>
-                <w:id w:val="799098826"/>
+                <w:id w:val="-1428864471"/>
                 <w:tag w:val="goog_rdk_322"/>
               </w:sdtPr>
               <w:sdtContent>
@@ -19674,7 +19728,7 @@
             <w:sdt>
               <w:sdtPr>
                 <w:lock w:val="contentLocked"/>
-                <w:id w:val="1322147749"/>
+                <w:id w:val="1711849373"/>
                 <w:tag w:val="goog_rdk_323"/>
               </w:sdtPr>
               <w:sdtContent>
@@ -19727,7 +19781,7 @@
             <w:sdt>
               <w:sdtPr>
                 <w:lock w:val="contentLocked"/>
-                <w:id w:val="2014726874"/>
+                <w:id w:val="784991099"/>
                 <w:tag w:val="goog_rdk_324"/>
               </w:sdtPr>
               <w:sdtContent>
@@ -19779,7 +19833,7 @@
             <w:sdt>
               <w:sdtPr>
                 <w:lock w:val="contentLocked"/>
-                <w:id w:val="185045907"/>
+                <w:id w:val="-1819157747"/>
                 <w:tag w:val="goog_rdk_325"/>
               </w:sdtPr>
               <w:sdtContent>
@@ -19837,7 +19891,7 @@
             <w:sdt>
               <w:sdtPr>
                 <w:lock w:val="contentLocked"/>
-                <w:id w:val="-680624760"/>
+                <w:id w:val="1965530854"/>
                 <w:tag w:val="goog_rdk_326"/>
               </w:sdtPr>
               <w:sdtContent>
@@ -19887,7 +19941,7 @@
             <w:sdt>
               <w:sdtPr>
                 <w:lock w:val="contentLocked"/>
-                <w:id w:val="245070622"/>
+                <w:id w:val="-472180873"/>
                 <w:tag w:val="goog_rdk_327"/>
               </w:sdtPr>
               <w:sdtContent>
@@ -19936,7 +19990,7 @@
             <w:sdt>
               <w:sdtPr>
                 <w:lock w:val="contentLocked"/>
-                <w:id w:val="-33602101"/>
+                <w:id w:val="1453624674"/>
                 <w:tag w:val="goog_rdk_328"/>
               </w:sdtPr>
               <w:sdtContent>
@@ -19989,7 +20043,7 @@
             <w:sdt>
               <w:sdtPr>
                 <w:lock w:val="contentLocked"/>
-                <w:id w:val="-959118033"/>
+                <w:id w:val="2067145430"/>
                 <w:tag w:val="goog_rdk_329"/>
               </w:sdtPr>
               <w:sdtContent>
@@ -20041,7 +20095,7 @@
             <w:sdt>
               <w:sdtPr>
                 <w:lock w:val="contentLocked"/>
-                <w:id w:val="-463645760"/>
+                <w:id w:val="-54572468"/>
                 <w:tag w:val="goog_rdk_330"/>
               </w:sdtPr>
               <w:sdtContent>
@@ -20099,7 +20153,7 @@
             <w:sdt>
               <w:sdtPr>
                 <w:lock w:val="contentLocked"/>
-                <w:id w:val="-894674949"/>
+                <w:id w:val="148102748"/>
                 <w:tag w:val="goog_rdk_331"/>
               </w:sdtPr>
               <w:sdtContent>
@@ -20149,7 +20203,7 @@
             <w:sdt>
               <w:sdtPr>
                 <w:lock w:val="contentLocked"/>
-                <w:id w:val="-438011961"/>
+                <w:id w:val="301612434"/>
                 <w:tag w:val="goog_rdk_332"/>
               </w:sdtPr>
               <w:sdtContent>
@@ -20198,7 +20252,7 @@
             <w:sdt>
               <w:sdtPr>
                 <w:lock w:val="contentLocked"/>
-                <w:id w:val="543690638"/>
+                <w:id w:val="-1175594713"/>
                 <w:tag w:val="goog_rdk_333"/>
               </w:sdtPr>
               <w:sdtContent>
@@ -20251,7 +20305,7 @@
             <w:sdt>
               <w:sdtPr>
                 <w:lock w:val="contentLocked"/>
-                <w:id w:val="1843072466"/>
+                <w:id w:val="-601818744"/>
                 <w:tag w:val="goog_rdk_334"/>
               </w:sdtPr>
               <w:sdtContent>
@@ -20303,7 +20357,7 @@
             <w:sdt>
               <w:sdtPr>
                 <w:lock w:val="contentLocked"/>
-                <w:id w:val="-1866204039"/>
+                <w:id w:val="1076695314"/>
                 <w:tag w:val="goog_rdk_335"/>
               </w:sdtPr>
               <w:sdtContent>
@@ -20361,7 +20415,7 @@
             <w:sdt>
               <w:sdtPr>
                 <w:lock w:val="contentLocked"/>
-                <w:id w:val="-13640730"/>
+                <w:id w:val="395118774"/>
                 <w:tag w:val="goog_rdk_336"/>
               </w:sdtPr>
               <w:sdtContent>
@@ -20411,7 +20465,7 @@
             <w:sdt>
               <w:sdtPr>
                 <w:lock w:val="contentLocked"/>
-                <w:id w:val="-2079269567"/>
+                <w:id w:val="877745602"/>
                 <w:tag w:val="goog_rdk_337"/>
               </w:sdtPr>
               <w:sdtContent>
@@ -20460,7 +20514,7 @@
             <w:sdt>
               <w:sdtPr>
                 <w:lock w:val="contentLocked"/>
-                <w:id w:val="-1520726929"/>
+                <w:id w:val="655340947"/>
                 <w:tag w:val="goog_rdk_338"/>
               </w:sdtPr>
               <w:sdtContent>
@@ -20513,7 +20567,7 @@
             <w:sdt>
               <w:sdtPr>
                 <w:lock w:val="contentLocked"/>
-                <w:id w:val="989127200"/>
+                <w:id w:val="1518196722"/>
                 <w:tag w:val="goog_rdk_339"/>
               </w:sdtPr>
               <w:sdtContent>
@@ -20565,7 +20619,7 @@
             <w:sdt>
               <w:sdtPr>
                 <w:lock w:val="contentLocked"/>
-                <w:id w:val="-639817958"/>
+                <w:id w:val="-1131836680"/>
                 <w:tag w:val="goog_rdk_340"/>
               </w:sdtPr>
               <w:sdtContent>
@@ -20623,7 +20677,7 @@
             <w:sdt>
               <w:sdtPr>
                 <w:lock w:val="contentLocked"/>
-                <w:id w:val="1085076293"/>
+                <w:id w:val="1724170556"/>
                 <w:tag w:val="goog_rdk_341"/>
               </w:sdtPr>
               <w:sdtContent>
@@ -20673,7 +20727,7 @@
             <w:sdt>
               <w:sdtPr>
                 <w:lock w:val="contentLocked"/>
-                <w:id w:val="526068663"/>
+                <w:id w:val="-1987086679"/>
                 <w:tag w:val="goog_rdk_342"/>
               </w:sdtPr>
               <w:sdtContent>
@@ -20722,7 +20776,7 @@
             <w:sdt>
               <w:sdtPr>
                 <w:lock w:val="contentLocked"/>
-                <w:id w:val="-1540683492"/>
+                <w:id w:val="1339352142"/>
                 <w:tag w:val="goog_rdk_343"/>
               </w:sdtPr>
               <w:sdtContent>
@@ -20775,7 +20829,7 @@
             <w:sdt>
               <w:sdtPr>
                 <w:lock w:val="contentLocked"/>
-                <w:id w:val="1743335807"/>
+                <w:id w:val="151571236"/>
                 <w:tag w:val="goog_rdk_344"/>
               </w:sdtPr>
               <w:sdtContent>
@@ -20827,7 +20881,7 @@
             <w:sdt>
               <w:sdtPr>
                 <w:lock w:val="contentLocked"/>
-                <w:id w:val="1215172246"/>
+                <w:id w:val="-800466262"/>
                 <w:tag w:val="goog_rdk_345"/>
               </w:sdtPr>
               <w:sdtContent>
@@ -20885,7 +20939,7 @@
             <w:sdt>
               <w:sdtPr>
                 <w:lock w:val="contentLocked"/>
-                <w:id w:val="1502360890"/>
+                <w:id w:val="-1179611557"/>
                 <w:tag w:val="goog_rdk_346"/>
               </w:sdtPr>
               <w:sdtContent>
@@ -20938,7 +20992,7 @@
             <w:sdt>
               <w:sdtPr>
                 <w:lock w:val="contentLocked"/>
-                <w:id w:val="-1489756721"/>
+                <w:id w:val="-833609245"/>
                 <w:tag w:val="goog_rdk_347"/>
               </w:sdtPr>
               <w:sdtContent>
@@ -20990,7 +21044,7 @@
             <w:sdt>
               <w:sdtPr>
                 <w:lock w:val="contentLocked"/>
-                <w:id w:val="-1726615811"/>
+                <w:id w:val="-1860711292"/>
                 <w:tag w:val="goog_rdk_348"/>
               </w:sdtPr>
               <w:sdtContent>
@@ -21041,7 +21095,7 @@
             <w:sdt>
               <w:sdtPr>
                 <w:lock w:val="contentLocked"/>
-                <w:id w:val="-336588739"/>
+                <w:id w:val="844369977"/>
                 <w:tag w:val="goog_rdk_349"/>
               </w:sdtPr>
               <w:sdtContent>
@@ -21092,7 +21146,7 @@
             <w:sdt>
               <w:sdtPr>
                 <w:lock w:val="contentLocked"/>
-                <w:id w:val="34726043"/>
+                <w:id w:val="1584259667"/>
                 <w:tag w:val="goog_rdk_350"/>
               </w:sdtPr>
               <w:sdtContent>
@@ -21150,7 +21204,7 @@
             <w:sdt>
               <w:sdtPr>
                 <w:lock w:val="contentLocked"/>
-                <w:id w:val="-738743063"/>
+                <w:id w:val="-1987333662"/>
                 <w:tag w:val="goog_rdk_351"/>
               </w:sdtPr>
               <w:sdtContent>
@@ -21210,7 +21264,7 @@
             <w:sdt>
               <w:sdtPr>
                 <w:lock w:val="contentLocked"/>
-                <w:id w:val="1441438781"/>
+                <w:id w:val="-1337774431"/>
                 <w:tag w:val="goog_rdk_356"/>
               </w:sdtPr>
               <w:sdtContent>
@@ -21262,7 +21316,7 @@
             <w:sdt>
               <w:sdtPr>
                 <w:lock w:val="contentLocked"/>
-                <w:id w:val="171308781"/>
+                <w:id w:val="-921264046"/>
                 <w:tag w:val="goog_rdk_357"/>
               </w:sdtPr>
               <w:sdtContent>
@@ -21319,7 +21373,7 @@
             <w:sdt>
               <w:sdtPr>
                 <w:lock w:val="contentLocked"/>
-                <w:id w:val="1686405709"/>
+                <w:id w:val="2110481905"/>
                 <w:tag w:val="goog_rdk_361"/>
               </w:sdtPr>
               <w:sdtContent>
@@ -21371,7 +21425,7 @@
             <w:sdt>
               <w:sdtPr>
                 <w:lock w:val="contentLocked"/>
-                <w:id w:val="1677168509"/>
+                <w:id w:val="-355698793"/>
                 <w:tag w:val="goog_rdk_362"/>
               </w:sdtPr>
               <w:sdtContent>
@@ -21428,7 +21482,7 @@
             <w:sdt>
               <w:sdtPr>
                 <w:lock w:val="contentLocked"/>
-                <w:id w:val="1345523340"/>
+                <w:id w:val="1424147218"/>
                 <w:tag w:val="goog_rdk_366"/>
               </w:sdtPr>
               <w:sdtContent>
@@ -21480,7 +21534,7 @@
             <w:sdt>
               <w:sdtPr>
                 <w:lock w:val="contentLocked"/>
-                <w:id w:val="1169165637"/>
+                <w:id w:val="-1513143095"/>
                 <w:tag w:val="goog_rdk_367"/>
               </w:sdtPr>
               <w:sdtContent>
@@ -21537,7 +21591,7 @@
             <w:sdt>
               <w:sdtPr>
                 <w:lock w:val="contentLocked"/>
-                <w:id w:val="-407036157"/>
+                <w:id w:val="1876618373"/>
                 <w:tag w:val="goog_rdk_371"/>
               </w:sdtPr>
               <w:sdtContent>
@@ -21589,7 +21643,7 @@
             <w:sdt>
               <w:sdtPr>
                 <w:lock w:val="contentLocked"/>
-                <w:id w:val="-659142757"/>
+                <w:id w:val="1657626145"/>
                 <w:tag w:val="goog_rdk_372"/>
               </w:sdtPr>
               <w:sdtContent>
@@ -21646,7 +21700,7 @@
             <w:sdt>
               <w:sdtPr>
                 <w:lock w:val="contentLocked"/>
-                <w:id w:val="-1639890845"/>
+                <w:id w:val="496073900"/>
                 <w:tag w:val="goog_rdk_376"/>
               </w:sdtPr>
               <w:sdtContent>
@@ -21698,7 +21752,7 @@
             <w:sdt>
               <w:sdtPr>
                 <w:lock w:val="contentLocked"/>
-                <w:id w:val="-1943724527"/>
+                <w:id w:val="65827014"/>
                 <w:tag w:val="goog_rdk_377"/>
               </w:sdtPr>
               <w:sdtContent>
@@ -34196,12 +34250,12 @@
           <wp:inline distB="114300" distT="114300" distL="114300" distR="114300">
             <wp:extent cx="5731200" cy="4686300"/>
             <wp:effectExtent b="0" l="0" r="0" t="0"/>
-            <wp:docPr id="2" name="image4.jpg"/>
+            <wp:docPr id="2" name="image3.jpg"/>
             <a:graphic>
               <a:graphicData uri="http://schemas.openxmlformats.org/drawingml/2006/picture">
                 <pic:pic>
                   <pic:nvPicPr>
-                    <pic:cNvPr id="0" name="image4.jpg"/>
+                    <pic:cNvPr id="0" name="image3.jpg"/>
                     <pic:cNvPicPr preferRelativeResize="0"/>
                   </pic:nvPicPr>
                   <pic:blipFill>
@@ -34264,12 +34318,12 @@
           <wp:inline distB="114300" distT="114300" distL="114300" distR="114300">
             <wp:extent cx="5731200" cy="4686300"/>
             <wp:effectExtent b="0" l="0" r="0" t="0"/>
-            <wp:docPr id="4" name="image3.jpg"/>
+            <wp:docPr id="4" name="image4.jpg"/>
             <a:graphic>
               <a:graphicData uri="http://schemas.openxmlformats.org/drawingml/2006/picture">
                 <pic:pic>
                   <pic:nvPicPr>
-                    <pic:cNvPr id="0" name="image3.jpg"/>
+                    <pic:cNvPr id="0" name="image4.jpg"/>
                     <pic:cNvPicPr preferRelativeResize="0"/>
                   </pic:nvPicPr>
                   <pic:blipFill>

</xml_diff>